<commit_message>
results: TL final - Scratch 71.16% / FE 77.26% ECE=0.0127 / FT 90.65% ECE=0.0515 - add CM, per-class, ECE
</commit_message>
<xml_diff>
--- a/Report.TL.STL10.docx
+++ b/Report.TL.STL10.docx
@@ -21,7 +21,7 @@
         </w:rPr>
         <w:t>Practical Session 2 — Advanced Deep Learning Strategies</w:t>
         <w:br/>
-        <w:t>USTH Deep Learning 2026 | Duong Tan Binh — 2540007</w:t>
+        <w:t>USTH Deep Learning 2026  |  Duong Tan Binh — 2540007</w:t>
       </w:r>
     </w:p>
     <w:p/>
@@ -37,20 +37,18 @@
     <w:p>
       <w:r>
         <w:rPr>
-          <w:b w:val="0"/>
           <w:sz w:val="22"/>
         </w:rPr>
-        <w:t>Transfer learning is a technique that leverages knowledge acquired on a large source task to improve learning on a smaller target task. Instead of training a deep neural network from random initialisation, we initialise it with weights pre-trained on a large corpus — typically ImageNet — and then adapt those weights to the new domain. The key insight is that lower-level features learned from millions of images (edges, textures, shapes) generalise across visual domains.</w:t>
+        <w:t>Transfer learning leverages knowledge acquired from a large source task to improve learning on a smaller target task. Rather than training a deep network from random initialisation, we start from weights pre-trained on ImageNet (1.28 M images, 1 000 classes) and adapt them to the target domain. The key intuition is that convolutional layers learn transferable visual features — edges, textures, and shapes — that generalise across natural image datasets.</w:t>
       </w:r>
     </w:p>
     <w:p/>
     <w:p>
       <w:r>
         <w:rPr>
-          <w:b w:val="0"/>
           <w:sz w:val="22"/>
         </w:rPr>
-        <w:t>This experiment evaluates three transfer learning strategies on STL-10 — a benchmark dataset with 5 000 labeled 96×96 colour images across 10 classes, deliberately chosen to represent the data-scarce regime where transfer learning is most beneficial:</w:t>
+        <w:t>This experiment compares three strategies on STL-10, a benchmark dataset with 5 000 labelled 96×96 colour images across 10 classes, deliberately chosen to represent the small-data regime where transfer learning is most beneficial:</w:t>
       </w:r>
     </w:p>
     <w:p/>
@@ -62,7 +60,7 @@
         <w:rPr>
           <w:sz w:val="22"/>
         </w:rPr>
-        <w:t>From Scratch — ResNet-18 trained from random initialisation on STL-10 only.</w:t>
+        <w:t>From Scratch — ResNet-18 with random initialisation trained entirely on STL-10.</w:t>
       </w:r>
     </w:p>
     <w:p>
@@ -73,7 +71,7 @@
         <w:rPr>
           <w:sz w:val="22"/>
         </w:rPr>
-        <w:t>Feature Extraction — ImageNet pretrained backbone frozen; only the final FC head (10-class) is trained.</w:t>
+        <w:t>Feature Extraction — ImageNet backbone frozen; only the 10-class FC head is trained.</w:t>
       </w:r>
     </w:p>
     <w:p>
@@ -84,7 +82,7 @@
         <w:rPr>
           <w:sz w:val="22"/>
         </w:rPr>
-        <w:t>Fine-tuning — ImageNet pretrained backbone fully trainable with differential learning rates (backbone 10× lower than head) to avoid catastrophic forgetting.</w:t>
+        <w:t>Fine-tuning — ImageNet backbone fully trained with differential learning rates (backbone LR = 1/10 × head LR) to avoid catastrophic forgetting.</w:t>
       </w:r>
     </w:p>
     <w:p>
@@ -102,18 +100,233 @@
         <w:jc w:val="left"/>
       </w:pPr>
       <w:r>
-        <w:t>2.1 Transfer Learning Quadrant</w:t>
+        <w:t>2.1 Transfer Learning Strategy Selection</w:t>
       </w:r>
     </w:p>
     <w:p>
       <w:r>
         <w:rPr>
-          <w:b w:val="0"/>
           <w:sz w:val="22"/>
         </w:rPr>
-        <w:t>The choice of transfer learning strategy depends on two dimensions: dataset size and domain similarity. When the target dataset is small and the domain is similar to the source (ImageNet → STL-10 natural images), fine-tuning the full network or using a frozen feature extractor both yield strong results. STL-10 with 5 000 labeled samples sits firmly in this quadrant.</w:t>
+        <w:t>The choice of strategy depends on two dimensions: target dataset size and domain similarity to the source. The decision matrix from the course slides is:</w:t>
       </w:r>
     </w:p>
+    <w:p/>
+    <w:tbl>
+      <w:tblPr>
+        <w:tblStyle w:val="LightGrid-Accent1"/>
+        <w:tblW w:type="auto" w:w="0"/>
+        <w:jc w:val="center"/>
+        <w:tblLook w:firstColumn="1" w:firstRow="1" w:lastColumn="0" w:lastRow="0" w:noHBand="0" w:noVBand="1" w:val="04A0"/>
+      </w:tblPr>
+      <w:tblGrid>
+        <w:gridCol w:w="2928"/>
+        <w:gridCol w:w="2928"/>
+        <w:gridCol w:w="2928"/>
+      </w:tblGrid>
+      <w:tr>
+        <w:tc>
+          <w:tcPr>
+            <w:tcW w:type="dxa" w:w="2304"/>
+          </w:tcPr>
+          <w:p>
+            <w:pPr>
+              <w:jc w:val="center"/>
+            </w:pPr>
+            <w:r>
+              <w:rPr>
+                <w:b/>
+                <w:sz w:val="20"/>
+              </w:rPr>
+            </w:r>
+          </w:p>
+        </w:tc>
+        <w:tc>
+          <w:tcPr>
+            <w:tcW w:type="dxa" w:w="3888"/>
+          </w:tcPr>
+          <w:p>
+            <w:pPr>
+              <w:jc w:val="center"/>
+            </w:pPr>
+            <w:r>
+              <w:rPr>
+                <w:b/>
+                <w:sz w:val="20"/>
+              </w:rPr>
+              <w:t>Similar domain</w:t>
+            </w:r>
+          </w:p>
+        </w:tc>
+        <w:tc>
+          <w:tcPr>
+            <w:tcW w:type="dxa" w:w="3888"/>
+          </w:tcPr>
+          <w:p>
+            <w:pPr>
+              <w:jc w:val="center"/>
+            </w:pPr>
+            <w:r>
+              <w:rPr>
+                <w:b/>
+                <w:sz w:val="20"/>
+              </w:rPr>
+              <w:t>Different domain</w:t>
+            </w:r>
+          </w:p>
+        </w:tc>
+      </w:tr>
+      <w:tr>
+        <w:tc>
+          <w:tcPr>
+            <w:tcW w:type="dxa" w:w="2304"/>
+          </w:tcPr>
+          <w:p/>
+        </w:tc>
+        <w:tc>
+          <w:tcPr>
+            <w:tcW w:type="dxa" w:w="3888"/>
+          </w:tcPr>
+          <w:p/>
+        </w:tc>
+        <w:tc>
+          <w:tcPr>
+            <w:tcW w:type="dxa" w:w="3888"/>
+          </w:tcPr>
+          <w:p/>
+        </w:tc>
+      </w:tr>
+      <w:tr>
+        <w:tc>
+          <w:tcPr>
+            <w:tcW w:type="dxa" w:w="2304"/>
+          </w:tcPr>
+          <w:p/>
+        </w:tc>
+        <w:tc>
+          <w:tcPr>
+            <w:tcW w:type="dxa" w:w="3888"/>
+          </w:tcPr>
+          <w:p/>
+        </w:tc>
+        <w:tc>
+          <w:tcPr>
+            <w:tcW w:type="dxa" w:w="3888"/>
+          </w:tcPr>
+          <w:p/>
+        </w:tc>
+      </w:tr>
+      <w:tr>
+        <w:tc>
+          <w:tcPr>
+            <w:tcW w:type="dxa" w:w="2304"/>
+          </w:tcPr>
+          <w:p>
+            <w:pPr>
+              <w:jc w:val="center"/>
+            </w:pPr>
+            <w:r>
+              <w:rPr>
+                <w:sz w:val="20"/>
+              </w:rPr>
+              <w:t>Small dataset</w:t>
+            </w:r>
+          </w:p>
+        </w:tc>
+        <w:tc>
+          <w:tcPr>
+            <w:tcW w:type="dxa" w:w="3888"/>
+          </w:tcPr>
+          <w:p>
+            <w:pPr>
+              <w:jc w:val="center"/>
+            </w:pPr>
+            <w:r>
+              <w:rPr>
+                <w:sz w:val="20"/>
+              </w:rPr>
+              <w:t>Feature Extraction  ← this experiment</w:t>
+            </w:r>
+          </w:p>
+        </w:tc>
+        <w:tc>
+          <w:tcPr>
+            <w:tcW w:type="dxa" w:w="3888"/>
+          </w:tcPr>
+          <w:p>
+            <w:pPr>
+              <w:jc w:val="center"/>
+            </w:pPr>
+            <w:r>
+              <w:rPr>
+                <w:sz w:val="20"/>
+              </w:rPr>
+              <w:t>Fine-tune carefully</w:t>
+            </w:r>
+          </w:p>
+        </w:tc>
+      </w:tr>
+      <w:tr>
+        <w:tc>
+          <w:tcPr>
+            <w:tcW w:type="dxa" w:w="2304"/>
+          </w:tcPr>
+          <w:p>
+            <w:pPr>
+              <w:jc w:val="center"/>
+            </w:pPr>
+            <w:r>
+              <w:rPr>
+                <w:sz w:val="20"/>
+              </w:rPr>
+              <w:t>Large dataset</w:t>
+            </w:r>
+          </w:p>
+        </w:tc>
+        <w:tc>
+          <w:tcPr>
+            <w:tcW w:type="dxa" w:w="3888"/>
+          </w:tcPr>
+          <w:p>
+            <w:pPr>
+              <w:jc w:val="center"/>
+            </w:pPr>
+            <w:r>
+              <w:rPr>
+                <w:sz w:val="20"/>
+              </w:rPr>
+              <w:t>Fine-tune all layers</w:t>
+            </w:r>
+          </w:p>
+        </w:tc>
+        <w:tc>
+          <w:tcPr>
+            <w:tcW w:type="dxa" w:w="3888"/>
+          </w:tcPr>
+          <w:p>
+            <w:pPr>
+              <w:jc w:val="center"/>
+            </w:pPr>
+            <w:r>
+              <w:rPr>
+                <w:sz w:val="20"/>
+              </w:rPr>
+              <w:t>Train from scratch</w:t>
+            </w:r>
+          </w:p>
+        </w:tc>
+      </w:tr>
+    </w:tbl>
+    <w:p/>
+    <w:p>
+      <w:r>
+        <w:rPr>
+          <w:sz w:val="22"/>
+        </w:rPr>
+        <w:t>STL-10 (5 000 samples, natural images) sits in the small + similar quadrant, making Feature Extraction the theoretically recommended strategy. Fine-tuning is included as a comparison to quantify the benefit of full adaptation.</w:t>
+      </w:r>
+    </w:p>
+    <w:p/>
     <w:p>
       <w:pPr>
         <w:jc w:val="center"/>
@@ -162,7 +375,7 @@
           <w:i/>
           <w:sz w:val="20"/>
         </w:rPr>
-        <w:t>Figure 1: Transfer learning strategy selection based on dataset size and domain similarity</w:t>
+        <w:t>Figure 1: Transfer learning strategy selection quadrant. Our experiment (★) lies in the small + similar region.</w:t>
       </w:r>
     </w:p>
     <w:p/>
@@ -178,28 +391,25 @@
     <w:p>
       <w:r>
         <w:rPr>
-          <w:b w:val="0"/>
           <w:sz w:val="22"/>
         </w:rPr>
-        <w:t>In the feature extraction setting the pretrained convolutional backbone acts as a fixed mapping φ: ℝ^(H×W×3) → ℝ^d. Only the linear classifier on top is trained:</w:t>
+        <w:t>The pretrained backbone φ: ℝ^(96×96×3) → ℝ^512 is used as a fixed feature extractor. Only the linear classifier is trained:</w:t>
       </w:r>
     </w:p>
     <w:p>
       <w:r>
         <w:rPr>
-          <w:b w:val="0"/>
           <w:sz w:val="22"/>
         </w:rPr>
-        <w:t xml:space="preserve">    ŷ = W · φ(x) + b</w:t>
+        <w:t xml:space="preserve">        ŷ = W · φ(x) + b,    W ∈ ℝ^(10×512),  b ∈ ℝ^10</w:t>
       </w:r>
     </w:p>
     <w:p>
       <w:r>
         <w:rPr>
-          <w:b w:val="0"/>
           <w:sz w:val="22"/>
         </w:rPr>
-        <w:t>where W ∈ ℝ^(C×d) and b ∈ ℝ^C are the only learnable parameters. Because the backbone is frozen, the number of trainable parameters is reduced from 11.18 M to only 5,130 (the FC head), making training extremely fast and stable even with very limited data.</w:t>
+        <w:t>This reduces trainable parameters from 11,181,642 to only 5,130 (0.05% of the full model), making training extremely fast and resistant to overfitting on small datasets.</w:t>
       </w:r>
     </w:p>
     <w:p/>
@@ -215,30 +425,27 @@
     <w:p>
       <w:r>
         <w:rPr>
-          <w:b w:val="0"/>
           <w:sz w:val="22"/>
         </w:rPr>
-        <w:t>Fine-tuning unlocks all backbone parameters while protecting pretrained representations from catastrophic forgetting through differential learning rates:</w:t>
+        <w:t>All backbone parameters are made trainable, but with a 10× lower learning rate than the new head to preserve pretrained representations:</w:t>
       </w:r>
     </w:p>
     <w:p>
       <w:r>
         <w:rPr>
-          <w:b w:val="0"/>
           <w:sz w:val="22"/>
         </w:rPr>
-        <w:t xml:space="preserve">    θ_backbone ← θ_backbone - α_b · ∇L(θ_backbone)   [α_b = 1e-3]</w:t>
+        <w:t xml:space="preserve">        θ_backbone ← θ_backbone − α_b · ∇L    [α_b = 1×10⁻³]</w:t>
         <w:br/>
-        <w:t xml:space="preserve">    θ_head     ← θ_head     - α_h · ∇L(θ_head)       [α_h = 1e-2]</w:t>
+        <w:t xml:space="preserve">        θ_head     ← θ_head     − α_h · ∇L    [α_h = 1×10⁻²]</w:t>
       </w:r>
     </w:p>
     <w:p>
       <w:r>
         <w:rPr>
-          <w:b w:val="0"/>
           <w:sz w:val="22"/>
         </w:rPr>
-        <w:t>The backbone LR (α_b = 1×10⁻³) is 10× lower than the head LR (α_h = 1×10⁻²). This asymmetry allows the new head to adapt quickly while the backbone shifts only gently, preserving the learned visual hierarchy.</w:t>
+        <w:t>Setting α_b ≪ α_h prevents catastrophic forgetting: the backbone shifts gently while the new head adapts rapidly to the 10-class target task. Both use cosine annealing to decay smoothly to near-zero by epoch 30.</w:t>
       </w:r>
     </w:p>
     <w:p/>
@@ -254,10 +461,9 @@
     <w:p>
       <w:r>
         <w:rPr>
-          <w:b w:val="0"/>
           <w:sz w:val="22"/>
         </w:rPr>
-        <w:t>A key architectural constraint governs this choice. The standard ResNet-18 uses a 7×7 conv1 followed by a 3×3 max-pool (total stride 4). When applied to 32×32 images, the feature map after layer4 collapses to 1×1 — destroying spatial structure and making ImageNet features uninformative. With 96×96 inputs, the spatial resolution at each stage is:</w:t>
+        <w:t>Standard ResNet-18 uses a 7×7 stride-2 conv1 followed by 3×3 max-pool (total stride 4). With 32×32 CIFAR-10 images, the feature map after layer4 collapses to 1×1 — destroying spatial structure and making pretrained features uninformative. With 96×96 STL-10 images:</w:t>
       </w:r>
     </w:p>
     <w:tbl>
@@ -274,7 +480,7 @@
       <w:tr>
         <w:tc>
           <w:tcPr>
-            <w:tcW w:type="dxa" w:w="3600"/>
+            <w:tcW w:type="dxa" w:w="4032"/>
           </w:tcPr>
           <w:p>
             <w:pPr>
@@ -285,13 +491,13 @@
                 <w:b/>
                 <w:sz w:val="20"/>
               </w:rPr>
-              <w:t>Stage</w:t>
+              <w:t>Layer</w:t>
             </w:r>
           </w:p>
         </w:tc>
         <w:tc>
           <w:tcPr>
-            <w:tcW w:type="dxa" w:w="3600"/>
+            <w:tcW w:type="dxa" w:w="4608"/>
           </w:tcPr>
           <w:p>
             <w:pPr>
@@ -302,7 +508,7 @@
                 <w:b/>
                 <w:sz w:val="20"/>
               </w:rPr>
-              <w:t>Spatial Size</w:t>
+              <w:t>Output size</w:t>
             </w:r>
           </w:p>
         </w:tc>
@@ -310,13 +516,13 @@
       <w:tr>
         <w:tc>
           <w:tcPr>
-            <w:tcW w:type="dxa" w:w="3600"/>
+            <w:tcW w:type="dxa" w:w="4032"/>
           </w:tcPr>
           <w:p/>
         </w:tc>
         <w:tc>
           <w:tcPr>
-            <w:tcW w:type="dxa" w:w="3600"/>
+            <w:tcW w:type="dxa" w:w="4608"/>
           </w:tcPr>
           <w:p/>
         </w:tc>
@@ -324,13 +530,13 @@
       <w:tr>
         <w:tc>
           <w:tcPr>
-            <w:tcW w:type="dxa" w:w="3600"/>
+            <w:tcW w:type="dxa" w:w="4032"/>
           </w:tcPr>
           <w:p/>
         </w:tc>
         <w:tc>
           <w:tcPr>
-            <w:tcW w:type="dxa" w:w="3600"/>
+            <w:tcW w:type="dxa" w:w="4608"/>
           </w:tcPr>
           <w:p/>
         </w:tc>
@@ -338,13 +544,13 @@
       <w:tr>
         <w:tc>
           <w:tcPr>
-            <w:tcW w:type="dxa" w:w="3600"/>
+            <w:tcW w:type="dxa" w:w="4032"/>
           </w:tcPr>
           <w:p/>
         </w:tc>
         <w:tc>
           <w:tcPr>
-            <w:tcW w:type="dxa" w:w="3600"/>
+            <w:tcW w:type="dxa" w:w="4608"/>
           </w:tcPr>
           <w:p/>
         </w:tc>
@@ -352,13 +558,13 @@
       <w:tr>
         <w:tc>
           <w:tcPr>
-            <w:tcW w:type="dxa" w:w="3600"/>
+            <w:tcW w:type="dxa" w:w="4032"/>
           </w:tcPr>
           <w:p/>
         </w:tc>
         <w:tc>
           <w:tcPr>
-            <w:tcW w:type="dxa" w:w="3600"/>
+            <w:tcW w:type="dxa" w:w="4608"/>
           </w:tcPr>
           <w:p/>
         </w:tc>
@@ -366,13 +572,13 @@
       <w:tr>
         <w:tc>
           <w:tcPr>
-            <w:tcW w:type="dxa" w:w="3600"/>
+            <w:tcW w:type="dxa" w:w="4032"/>
           </w:tcPr>
           <w:p/>
         </w:tc>
         <w:tc>
           <w:tcPr>
-            <w:tcW w:type="dxa" w:w="3600"/>
+            <w:tcW w:type="dxa" w:w="4608"/>
           </w:tcPr>
           <w:p/>
         </w:tc>
@@ -380,13 +586,13 @@
       <w:tr>
         <w:tc>
           <w:tcPr>
-            <w:tcW w:type="dxa" w:w="3600"/>
+            <w:tcW w:type="dxa" w:w="4032"/>
           </w:tcPr>
           <w:p/>
         </w:tc>
         <w:tc>
           <w:tcPr>
-            <w:tcW w:type="dxa" w:w="3600"/>
+            <w:tcW w:type="dxa" w:w="4608"/>
           </w:tcPr>
           <w:p/>
         </w:tc>
@@ -394,13 +600,13 @@
       <w:tr>
         <w:tc>
           <w:tcPr>
-            <w:tcW w:type="dxa" w:w="3600"/>
+            <w:tcW w:type="dxa" w:w="4032"/>
           </w:tcPr>
           <w:p/>
         </w:tc>
         <w:tc>
           <w:tcPr>
-            <w:tcW w:type="dxa" w:w="3600"/>
+            <w:tcW w:type="dxa" w:w="4608"/>
           </w:tcPr>
           <w:p/>
         </w:tc>
@@ -408,7 +614,21 @@
       <w:tr>
         <w:tc>
           <w:tcPr>
-            <w:tcW w:type="dxa" w:w="3600"/>
+            <w:tcW w:type="dxa" w:w="4032"/>
+          </w:tcPr>
+          <w:p/>
+        </w:tc>
+        <w:tc>
+          <w:tcPr>
+            <w:tcW w:type="dxa" w:w="4608"/>
+          </w:tcPr>
+          <w:p/>
+        </w:tc>
+      </w:tr>
+      <w:tr>
+        <w:tc>
+          <w:tcPr>
+            <w:tcW w:type="dxa" w:w="4032"/>
           </w:tcPr>
           <w:p>
             <w:pPr>
@@ -424,7 +644,7 @@
         </w:tc>
         <w:tc>
           <w:tcPr>
-            <w:tcW w:type="dxa" w:w="3600"/>
+            <w:tcW w:type="dxa" w:w="4608"/>
           </w:tcPr>
           <w:p>
             <w:pPr>
@@ -442,7 +662,7 @@
       <w:tr>
         <w:tc>
           <w:tcPr>
-            <w:tcW w:type="dxa" w:w="3600"/>
+            <w:tcW w:type="dxa" w:w="4032"/>
           </w:tcPr>
           <w:p>
             <w:pPr>
@@ -452,13 +672,13 @@
               <w:rPr>
                 <w:sz w:val="20"/>
               </w:rPr>
-              <w:t>conv1 (7×7, s=2)</w:t>
+              <w:t>conv1  (7×7, stride 2)</w:t>
             </w:r>
           </w:p>
         </w:tc>
         <w:tc>
           <w:tcPr>
-            <w:tcW w:type="dxa" w:w="3600"/>
+            <w:tcW w:type="dxa" w:w="4608"/>
           </w:tcPr>
           <w:p>
             <w:pPr>
@@ -476,7 +696,7 @@
       <w:tr>
         <w:tc>
           <w:tcPr>
-            <w:tcW w:type="dxa" w:w="3600"/>
+            <w:tcW w:type="dxa" w:w="4032"/>
           </w:tcPr>
           <w:p>
             <w:pPr>
@@ -486,13 +706,13 @@
               <w:rPr>
                 <w:sz w:val="20"/>
               </w:rPr>
-              <w:t>maxpool (3×3, s=2)</w:t>
+              <w:t>maxpool (3×3, stride 2)</w:t>
             </w:r>
           </w:p>
         </w:tc>
         <w:tc>
           <w:tcPr>
-            <w:tcW w:type="dxa" w:w="3600"/>
+            <w:tcW w:type="dxa" w:w="4608"/>
           </w:tcPr>
           <w:p>
             <w:pPr>
@@ -510,7 +730,7 @@
       <w:tr>
         <w:tc>
           <w:tcPr>
-            <w:tcW w:type="dxa" w:w="3600"/>
+            <w:tcW w:type="dxa" w:w="4032"/>
           </w:tcPr>
           <w:p>
             <w:pPr>
@@ -520,13 +740,13 @@
               <w:rPr>
                 <w:sz w:val="20"/>
               </w:rPr>
-              <w:t>layer1</w:t>
+              <w:t>layer1  (stride 1)</w:t>
             </w:r>
           </w:p>
         </w:tc>
         <w:tc>
           <w:tcPr>
-            <w:tcW w:type="dxa" w:w="3600"/>
+            <w:tcW w:type="dxa" w:w="4608"/>
           </w:tcPr>
           <w:p>
             <w:pPr>
@@ -544,7 +764,7 @@
       <w:tr>
         <w:tc>
           <w:tcPr>
-            <w:tcW w:type="dxa" w:w="3600"/>
+            <w:tcW w:type="dxa" w:w="4032"/>
           </w:tcPr>
           <w:p>
             <w:pPr>
@@ -554,13 +774,13 @@
               <w:rPr>
                 <w:sz w:val="20"/>
               </w:rPr>
-              <w:t>layer2</w:t>
+              <w:t>layer2  (stride 2)</w:t>
             </w:r>
           </w:p>
         </w:tc>
         <w:tc>
           <w:tcPr>
-            <w:tcW w:type="dxa" w:w="3600"/>
+            <w:tcW w:type="dxa" w:w="4608"/>
           </w:tcPr>
           <w:p>
             <w:pPr>
@@ -578,7 +798,7 @@
       <w:tr>
         <w:tc>
           <w:tcPr>
-            <w:tcW w:type="dxa" w:w="3600"/>
+            <w:tcW w:type="dxa" w:w="4032"/>
           </w:tcPr>
           <w:p>
             <w:pPr>
@@ -588,13 +808,13 @@
               <w:rPr>
                 <w:sz w:val="20"/>
               </w:rPr>
-              <w:t>layer3</w:t>
+              <w:t>layer3  (stride 2)</w:t>
             </w:r>
           </w:p>
         </w:tc>
         <w:tc>
           <w:tcPr>
-            <w:tcW w:type="dxa" w:w="3600"/>
+            <w:tcW w:type="dxa" w:w="4608"/>
           </w:tcPr>
           <w:p>
             <w:pPr>
@@ -612,7 +832,7 @@
       <w:tr>
         <w:tc>
           <w:tcPr>
-            <w:tcW w:type="dxa" w:w="3600"/>
+            <w:tcW w:type="dxa" w:w="4032"/>
           </w:tcPr>
           <w:p>
             <w:pPr>
@@ -622,13 +842,13 @@
               <w:rPr>
                 <w:sz w:val="20"/>
               </w:rPr>
-              <w:t>layer4</w:t>
+              <w:t>layer4  (stride 2)</w:t>
             </w:r>
           </w:p>
         </w:tc>
         <w:tc>
           <w:tcPr>
-            <w:tcW w:type="dxa" w:w="3600"/>
+            <w:tcW w:type="dxa" w:w="4608"/>
           </w:tcPr>
           <w:p>
             <w:pPr>
@@ -643,15 +863,48 @@
           </w:p>
         </w:tc>
       </w:tr>
+      <w:tr>
+        <w:tc>
+          <w:tcPr>
+            <w:tcW w:type="dxa" w:w="4032"/>
+          </w:tcPr>
+          <w:p>
+            <w:pPr>
+              <w:jc w:val="center"/>
+            </w:pPr>
+            <w:r>
+              <w:rPr>
+                <w:sz w:val="20"/>
+              </w:rPr>
+              <w:t>avgpool + fc</w:t>
+            </w:r>
+          </w:p>
+        </w:tc>
+        <w:tc>
+          <w:tcPr>
+            <w:tcW w:type="dxa" w:w="4608"/>
+          </w:tcPr>
+          <w:p>
+            <w:pPr>
+              <w:jc w:val="center"/>
+            </w:pPr>
+            <w:r>
+              <w:rPr>
+                <w:sz w:val="20"/>
+              </w:rPr>
+              <w:t>512 → 10</w:t>
+            </w:r>
+          </w:p>
+        </w:tc>
+      </w:tr>
     </w:tbl>
     <w:p/>
     <w:p>
       <w:r>
         <w:rPr>
-          <w:b w:val="0"/>
           <w:sz w:val="22"/>
         </w:rPr>
-        <w:t>The 3×3 feature maps at layer4 retain meaningful spatial structure, enabling ImageNet pretrained features to transfer effectively to STL-10.</w:t>
+        <w:t>The 3×3 feature maps at layer4 retain meaningful spatial structure, allowing ImageNet pretrained features to generalise effectively to STL-10.</w:t>
       </w:r>
     </w:p>
     <w:p>
@@ -677,7 +930,7 @@
       <w:tr>
         <w:tc>
           <w:tcPr>
-            <w:tcW w:type="dxa" w:w="3600"/>
+            <w:tcW w:type="dxa" w:w="3456"/>
           </w:tcPr>
           <w:p>
             <w:pPr>
@@ -694,7 +947,7 @@
         </w:tc>
         <w:tc>
           <w:tcPr>
-            <w:tcW w:type="dxa" w:w="5760"/>
+            <w:tcW w:type="dxa" w:w="6624"/>
           </w:tcPr>
           <w:p>
             <w:pPr>
@@ -713,13 +966,13 @@
       <w:tr>
         <w:tc>
           <w:tcPr>
-            <w:tcW w:type="dxa" w:w="3600"/>
+            <w:tcW w:type="dxa" w:w="3456"/>
           </w:tcPr>
           <w:p/>
         </w:tc>
         <w:tc>
           <w:tcPr>
-            <w:tcW w:type="dxa" w:w="5760"/>
+            <w:tcW w:type="dxa" w:w="6624"/>
           </w:tcPr>
           <w:p/>
         </w:tc>
@@ -727,13 +980,13 @@
       <w:tr>
         <w:tc>
           <w:tcPr>
-            <w:tcW w:type="dxa" w:w="3600"/>
+            <w:tcW w:type="dxa" w:w="3456"/>
           </w:tcPr>
           <w:p/>
         </w:tc>
         <w:tc>
           <w:tcPr>
-            <w:tcW w:type="dxa" w:w="5760"/>
+            <w:tcW w:type="dxa" w:w="6624"/>
           </w:tcPr>
           <w:p/>
         </w:tc>
@@ -741,13 +994,13 @@
       <w:tr>
         <w:tc>
           <w:tcPr>
-            <w:tcW w:type="dxa" w:w="3600"/>
+            <w:tcW w:type="dxa" w:w="3456"/>
           </w:tcPr>
           <w:p/>
         </w:tc>
         <w:tc>
           <w:tcPr>
-            <w:tcW w:type="dxa" w:w="5760"/>
+            <w:tcW w:type="dxa" w:w="6624"/>
           </w:tcPr>
           <w:p/>
         </w:tc>
@@ -755,13 +1008,13 @@
       <w:tr>
         <w:tc>
           <w:tcPr>
-            <w:tcW w:type="dxa" w:w="3600"/>
+            <w:tcW w:type="dxa" w:w="3456"/>
           </w:tcPr>
           <w:p/>
         </w:tc>
         <w:tc>
           <w:tcPr>
-            <w:tcW w:type="dxa" w:w="5760"/>
+            <w:tcW w:type="dxa" w:w="6624"/>
           </w:tcPr>
           <w:p/>
         </w:tc>
@@ -769,13 +1022,13 @@
       <w:tr>
         <w:tc>
           <w:tcPr>
-            <w:tcW w:type="dxa" w:w="3600"/>
+            <w:tcW w:type="dxa" w:w="3456"/>
           </w:tcPr>
           <w:p/>
         </w:tc>
         <w:tc>
           <w:tcPr>
-            <w:tcW w:type="dxa" w:w="5760"/>
+            <w:tcW w:type="dxa" w:w="6624"/>
           </w:tcPr>
           <w:p/>
         </w:tc>
@@ -783,13 +1036,13 @@
       <w:tr>
         <w:tc>
           <w:tcPr>
-            <w:tcW w:type="dxa" w:w="3600"/>
+            <w:tcW w:type="dxa" w:w="3456"/>
           </w:tcPr>
           <w:p/>
         </w:tc>
         <w:tc>
           <w:tcPr>
-            <w:tcW w:type="dxa" w:w="5760"/>
+            <w:tcW w:type="dxa" w:w="6624"/>
           </w:tcPr>
           <w:p/>
         </w:tc>
@@ -797,13 +1050,13 @@
       <w:tr>
         <w:tc>
           <w:tcPr>
-            <w:tcW w:type="dxa" w:w="3600"/>
+            <w:tcW w:type="dxa" w:w="3456"/>
           </w:tcPr>
           <w:p/>
         </w:tc>
         <w:tc>
           <w:tcPr>
-            <w:tcW w:type="dxa" w:w="5760"/>
+            <w:tcW w:type="dxa" w:w="6624"/>
           </w:tcPr>
           <w:p/>
         </w:tc>
@@ -811,7 +1064,21 @@
       <w:tr>
         <w:tc>
           <w:tcPr>
-            <w:tcW w:type="dxa" w:w="3600"/>
+            <w:tcW w:type="dxa" w:w="3456"/>
+          </w:tcPr>
+          <w:p/>
+        </w:tc>
+        <w:tc>
+          <w:tcPr>
+            <w:tcW w:type="dxa" w:w="6624"/>
+          </w:tcPr>
+          <w:p/>
+        </w:tc>
+      </w:tr>
+      <w:tr>
+        <w:tc>
+          <w:tcPr>
+            <w:tcW w:type="dxa" w:w="3456"/>
           </w:tcPr>
           <w:p>
             <w:pPr>
@@ -827,7 +1094,7 @@
         </w:tc>
         <w:tc>
           <w:tcPr>
-            <w:tcW w:type="dxa" w:w="5760"/>
+            <w:tcW w:type="dxa" w:w="6624"/>
           </w:tcPr>
           <w:p>
             <w:pPr>
@@ -845,7 +1112,7 @@
       <w:tr>
         <w:tc>
           <w:tcPr>
-            <w:tcW w:type="dxa" w:w="3600"/>
+            <w:tcW w:type="dxa" w:w="3456"/>
           </w:tcPr>
           <w:p>
             <w:pPr>
@@ -861,7 +1128,7 @@
         </w:tc>
         <w:tc>
           <w:tcPr>
-            <w:tcW w:type="dxa" w:w="5760"/>
+            <w:tcW w:type="dxa" w:w="6624"/>
           </w:tcPr>
           <w:p>
             <w:pPr>
@@ -879,7 +1146,7 @@
       <w:tr>
         <w:tc>
           <w:tcPr>
-            <w:tcW w:type="dxa" w:w="3600"/>
+            <w:tcW w:type="dxa" w:w="3456"/>
           </w:tcPr>
           <w:p>
             <w:pPr>
@@ -895,7 +1162,7 @@
         </w:tc>
         <w:tc>
           <w:tcPr>
-            <w:tcW w:type="dxa" w:w="5760"/>
+            <w:tcW w:type="dxa" w:w="6624"/>
           </w:tcPr>
           <w:p>
             <w:pPr>
@@ -905,7 +1172,7 @@
               <w:rPr>
                 <w:sz w:val="20"/>
               </w:rPr>
-              <w:t>5 000 (500 per class)</w:t>
+              <w:t>5 000  (500 per class)</w:t>
             </w:r>
           </w:p>
         </w:tc>
@@ -913,7 +1180,7 @@
       <w:tr>
         <w:tc>
           <w:tcPr>
-            <w:tcW w:type="dxa" w:w="3600"/>
+            <w:tcW w:type="dxa" w:w="3456"/>
           </w:tcPr>
           <w:p>
             <w:pPr>
@@ -929,7 +1196,7 @@
         </w:tc>
         <w:tc>
           <w:tcPr>
-            <w:tcW w:type="dxa" w:w="5760"/>
+            <w:tcW w:type="dxa" w:w="6624"/>
           </w:tcPr>
           <w:p>
             <w:pPr>
@@ -947,7 +1214,7 @@
       <w:tr>
         <w:tc>
           <w:tcPr>
-            <w:tcW w:type="dxa" w:w="3600"/>
+            <w:tcW w:type="dxa" w:w="3456"/>
           </w:tcPr>
           <w:p>
             <w:pPr>
@@ -963,7 +1230,7 @@
         </w:tc>
         <w:tc>
           <w:tcPr>
-            <w:tcW w:type="dxa" w:w="5760"/>
+            <w:tcW w:type="dxa" w:w="6624"/>
           </w:tcPr>
           <w:p>
             <w:pPr>
@@ -973,7 +1240,7 @@
               <w:rPr>
                 <w:sz w:val="20"/>
               </w:rPr>
-              <w:t>10 (airplane, bird, car, cat, deer, dog, horse, monkey, ship, truck)</w:t>
+              <w:t>10: airplane, bird, car, cat, deer, dog, horse, monkey, ship, truck</w:t>
             </w:r>
           </w:p>
         </w:tc>
@@ -981,7 +1248,7 @@
       <w:tr>
         <w:tc>
           <w:tcPr>
-            <w:tcW w:type="dxa" w:w="3600"/>
+            <w:tcW w:type="dxa" w:w="3456"/>
           </w:tcPr>
           <w:p>
             <w:pPr>
@@ -991,13 +1258,13 @@
               <w:rPr>
                 <w:sz w:val="20"/>
               </w:rPr>
-              <w:t>Source domain</w:t>
+              <w:t>Domain</w:t>
             </w:r>
           </w:p>
         </w:tc>
         <w:tc>
           <w:tcPr>
-            <w:tcW w:type="dxa" w:w="5760"/>
+            <w:tcW w:type="dxa" w:w="6624"/>
           </w:tcPr>
           <w:p>
             <w:pPr>
@@ -1007,7 +1274,7 @@
               <w:rPr>
                 <w:sz w:val="20"/>
               </w:rPr>
-              <w:t>ImageNet subset (similar natural image distribution)</w:t>
+              <w:t>Natural images (subset of ImageNet)</w:t>
             </w:r>
           </w:p>
         </w:tc>
@@ -1015,7 +1282,7 @@
       <w:tr>
         <w:tc>
           <w:tcPr>
-            <w:tcW w:type="dxa" w:w="3600"/>
+            <w:tcW w:type="dxa" w:w="3456"/>
           </w:tcPr>
           <w:p>
             <w:pPr>
@@ -1025,13 +1292,13 @@
               <w:rPr>
                 <w:sz w:val="20"/>
               </w:rPr>
-              <w:t>Normalization</w:t>
+              <w:t>Mean / Std</w:t>
             </w:r>
           </w:p>
         </w:tc>
         <w:tc>
           <w:tcPr>
-            <w:tcW w:type="dxa" w:w="5760"/>
+            <w:tcW w:type="dxa" w:w="6624"/>
           </w:tcPr>
           <w:p>
             <w:pPr>
@@ -1041,7 +1308,41 @@
               <w:rPr>
                 <w:sz w:val="20"/>
               </w:rPr>
-              <w:t>mean=[0.447,0.440,0.407]  std=[0.260,0.257,0.271]</w:t>
+              <w:t>[0.447, 0.440, 0.407] / [0.260, 0.257, 0.271]</w:t>
+            </w:r>
+          </w:p>
+        </w:tc>
+      </w:tr>
+      <w:tr>
+        <w:tc>
+          <w:tcPr>
+            <w:tcW w:type="dxa" w:w="3456"/>
+          </w:tcPr>
+          <w:p>
+            <w:pPr>
+              <w:jc w:val="center"/>
+            </w:pPr>
+            <w:r>
+              <w:rPr>
+                <w:sz w:val="20"/>
+              </w:rPr>
+              <w:t>Purpose</w:t>
+            </w:r>
+          </w:p>
+        </w:tc>
+        <w:tc>
+          <w:tcPr>
+            <w:tcW w:type="dxa" w:w="6624"/>
+          </w:tcPr>
+          <w:p>
+            <w:pPr>
+              <w:jc w:val="center"/>
+            </w:pPr>
+            <w:r>
+              <w:rPr>
+                <w:sz w:val="20"/>
+              </w:rPr>
+              <w:t>Designed as a transfer learning benchmark</w:t>
             </w:r>
           </w:p>
         </w:tc>
@@ -1051,10 +1352,9 @@
     <w:p>
       <w:r>
         <w:rPr>
-          <w:b w:val="0"/>
           <w:sz w:val="22"/>
         </w:rPr>
-        <w:t>STL-10 was designed as a transfer learning benchmark. Its small labeled set (5 000 samples) and natural image content make it an ideal testbed for comparing training strategies that differ in how they use pretrained ImageNet knowledge.</w:t>
+        <w:t>STL-10 was designed explicitly as a transfer learning benchmark. Its small labelled training set (5 000 images) and natural image content, which overlaps significantly with ImageNet categories, make it ideal for demonstrating when and why pretrained representations outperform random initialisation.</w:t>
       </w:r>
     </w:p>
     <w:p>
@@ -1078,10 +1378,9 @@
     <w:p>
       <w:r>
         <w:rPr>
-          <w:b w:val="0"/>
           <w:sz w:val="22"/>
         </w:rPr>
-        <w:t>All conditions use ResNet-18 with its original architecture (11.18 M parameters). The final FC layer is replaced with a new 512→10 linear layer, initialised with N(0, 0.01) weights. No architectural modifications are made to conv1 or maxpool — the original 7×7 stride-2 stem is preserved because STL-10 at 96×96 provides sufficient spatial resolution.</w:t>
+        <w:t>All three conditions share identical ResNet-18 architecture (11.18 M parameters). The final fully connected layer is replaced with a new 512 → 10 linear layer, initialised with N(0, 0.01) weights and zero bias. No other architectural modifications are made — the original 7×7 conv1 and max-pool are preserved.</w:t>
       </w:r>
     </w:p>
     <w:p/>
@@ -1390,6 +1689,124 @@
           <w:tcPr>
             <w:tcW w:type="dxa" w:w="3168"/>
           </w:tcPr>
+          <w:p/>
+        </w:tc>
+        <w:tc>
+          <w:tcPr>
+            <w:tcW w:type="dxa" w:w="2160"/>
+          </w:tcPr>
+          <w:p/>
+        </w:tc>
+        <w:tc>
+          <w:tcPr>
+            <w:tcW w:type="dxa" w:w="2880"/>
+          </w:tcPr>
+          <w:p/>
+        </w:tc>
+        <w:tc>
+          <w:tcPr>
+            <w:tcW w:type="dxa" w:w="3312"/>
+          </w:tcPr>
+          <w:p/>
+        </w:tc>
+      </w:tr>
+      <w:tr>
+        <w:tc>
+          <w:tcPr>
+            <w:tcW w:type="dxa" w:w="3168"/>
+          </w:tcPr>
+          <w:p/>
+        </w:tc>
+        <w:tc>
+          <w:tcPr>
+            <w:tcW w:type="dxa" w:w="2160"/>
+          </w:tcPr>
+          <w:p/>
+        </w:tc>
+        <w:tc>
+          <w:tcPr>
+            <w:tcW w:type="dxa" w:w="2880"/>
+          </w:tcPr>
+          <w:p/>
+        </w:tc>
+        <w:tc>
+          <w:tcPr>
+            <w:tcW w:type="dxa" w:w="3312"/>
+          </w:tcPr>
+          <w:p/>
+        </w:tc>
+      </w:tr>
+      <w:tr>
+        <w:tc>
+          <w:tcPr>
+            <w:tcW w:type="dxa" w:w="3168"/>
+          </w:tcPr>
+          <w:p>
+            <w:pPr>
+              <w:jc w:val="center"/>
+            </w:pPr>
+            <w:r>
+              <w:rPr>
+                <w:sz w:val="20"/>
+              </w:rPr>
+              <w:t>Pretrained weights</w:t>
+            </w:r>
+          </w:p>
+        </w:tc>
+        <w:tc>
+          <w:tcPr>
+            <w:tcW w:type="dxa" w:w="2160"/>
+          </w:tcPr>
+          <w:p>
+            <w:pPr>
+              <w:jc w:val="center"/>
+            </w:pPr>
+            <w:r>
+              <w:rPr>
+                <w:sz w:val="20"/>
+              </w:rPr>
+              <w:t>None</w:t>
+            </w:r>
+          </w:p>
+        </w:tc>
+        <w:tc>
+          <w:tcPr>
+            <w:tcW w:type="dxa" w:w="2880"/>
+          </w:tcPr>
+          <w:p>
+            <w:pPr>
+              <w:jc w:val="center"/>
+            </w:pPr>
+            <w:r>
+              <w:rPr>
+                <w:sz w:val="20"/>
+              </w:rPr>
+              <w:t>ImageNet-1K</w:t>
+            </w:r>
+          </w:p>
+        </w:tc>
+        <w:tc>
+          <w:tcPr>
+            <w:tcW w:type="dxa" w:w="3312"/>
+          </w:tcPr>
+          <w:p>
+            <w:pPr>
+              <w:jc w:val="center"/>
+            </w:pPr>
+            <w:r>
+              <w:rPr>
+                <w:sz w:val="20"/>
+              </w:rPr>
+              <w:t>ImageNet-1K</w:t>
+            </w:r>
+          </w:p>
+        </w:tc>
+      </w:tr>
+      <w:tr>
+        <w:tc>
+          <w:tcPr>
+            <w:tcW w:type="dxa" w:w="3168"/>
+          </w:tcPr>
           <w:p>
             <w:pPr>
               <w:jc w:val="center"/>
@@ -1464,7 +1881,7 @@
               <w:rPr>
                 <w:sz w:val="20"/>
               </w:rPr>
-              <w:t>Learning rate</w:t>
+              <w:t>LR (backbone)</w:t>
             </w:r>
           </w:p>
         </w:tc>
@@ -1496,7 +1913,7 @@
               <w:rPr>
                 <w:sz w:val="20"/>
               </w:rPr>
-              <w:t>1e-3</w:t>
+              <w:t>frozen</w:t>
             </w:r>
           </w:p>
         </w:tc>
@@ -1512,7 +1929,73 @@
               <w:rPr>
                 <w:sz w:val="20"/>
               </w:rPr>
-              <w:t>backbone 1e-3 / head 1e-2</w:t>
+              <w:t>1×10⁻³</w:t>
+            </w:r>
+          </w:p>
+        </w:tc>
+      </w:tr>
+      <w:tr>
+        <w:tc>
+          <w:tcPr>
+            <w:tcW w:type="dxa" w:w="3168"/>
+          </w:tcPr>
+          <w:p>
+            <w:pPr>
+              <w:jc w:val="center"/>
+            </w:pPr>
+            <w:r>
+              <w:rPr>
+                <w:sz w:val="20"/>
+              </w:rPr>
+              <w:t>LR (head)</w:t>
+            </w:r>
+          </w:p>
+        </w:tc>
+        <w:tc>
+          <w:tcPr>
+            <w:tcW w:type="dxa" w:w="2160"/>
+          </w:tcPr>
+          <w:p>
+            <w:pPr>
+              <w:jc w:val="center"/>
+            </w:pPr>
+            <w:r>
+              <w:rPr>
+                <w:sz w:val="20"/>
+              </w:rPr>
+              <w:t>0.01</w:t>
+            </w:r>
+          </w:p>
+        </w:tc>
+        <w:tc>
+          <w:tcPr>
+            <w:tcW w:type="dxa" w:w="2880"/>
+          </w:tcPr>
+          <w:p>
+            <w:pPr>
+              <w:jc w:val="center"/>
+            </w:pPr>
+            <w:r>
+              <w:rPr>
+                <w:sz w:val="20"/>
+              </w:rPr>
+              <w:t>1×10⁻³</w:t>
+            </w:r>
+          </w:p>
+        </w:tc>
+        <w:tc>
+          <w:tcPr>
+            <w:tcW w:type="dxa" w:w="3312"/>
+          </w:tcPr>
+          <w:p>
+            <w:pPr>
+              <w:jc w:val="center"/>
+            </w:pPr>
+            <w:r>
+              <w:rPr>
+                <w:sz w:val="20"/>
+              </w:rPr>
+              <w:t>1×10⁻²</w:t>
             </w:r>
           </w:p>
         </w:tc>
@@ -1612,7 +2095,7 @@
               <w:rPr>
                 <w:sz w:val="20"/>
               </w:rPr>
-              <w:t>5e-4</w:t>
+              <w:t>5×10⁻⁴</w:t>
             </w:r>
           </w:p>
         </w:tc>
@@ -1628,7 +2111,7 @@
               <w:rPr>
                 <w:sz w:val="20"/>
               </w:rPr>
-              <w:t>1e-4</w:t>
+              <w:t>1×10⁻⁴</w:t>
             </w:r>
           </w:p>
         </w:tc>
@@ -1644,7 +2127,7 @@
               <w:rPr>
                 <w:sz w:val="20"/>
               </w:rPr>
-              <w:t>5e-4</w:t>
+              <w:t>5×10⁻⁴</w:t>
             </w:r>
           </w:p>
         </w:tc>
@@ -1662,7 +2145,7 @@
               <w:rPr>
                 <w:sz w:val="20"/>
               </w:rPr>
-              <w:t>Scheduler</w:t>
+              <w:t>LR scheduler</w:t>
             </w:r>
           </w:p>
         </w:tc>
@@ -1927,12 +2410,65 @@
     <w:p>
       <w:r>
         <w:rPr>
-          <w:b w:val="0"/>
           <w:sz w:val="22"/>
         </w:rPr>
-        <w:t>Training transforms: RandomHorizontalFlip, RandomCrop(96, padding=12), ColorJitter(brightness=0.3, contrast=0.3, saturation=0.3), Normalize.</w:t>
+        <w:t>Training: RandomHorizontalFlip, RandomCrop(96, padding=12), ColorJitter(brightness=0.3, contrast=0.3, saturation=0.3), Normalize.</w:t>
         <w:br/>
-        <w:t>Test transforms: ToTensor, Normalize only (no augmentation).</w:t>
+        <w:t>Test: ToTensor + Normalize only (no augmentation). The same augmentation pipeline is applied to all three conditions.</w:t>
+      </w:r>
+    </w:p>
+    <w:p/>
+    <w:p>
+      <w:pPr>
+        <w:pStyle w:val="Heading2"/>
+        <w:jc w:val="left"/>
+      </w:pPr>
+      <w:r>
+        <w:t>4.4 Evaluation Metrics</w:t>
+      </w:r>
+    </w:p>
+    <w:p>
+      <w:pPr>
+        <w:pStyle w:val="ListBullet"/>
+      </w:pPr>
+      <w:r>
+        <w:rPr>
+          <w:sz w:val="22"/>
+        </w:rPr>
+        <w:t>Best validation accuracy — peak accuracy over all 30 epochs (best weights restored).</w:t>
+      </w:r>
+    </w:p>
+    <w:p>
+      <w:pPr>
+        <w:pStyle w:val="ListBullet"/>
+      </w:pPr>
+      <w:r>
+        <w:rPr>
+          <w:sz w:val="22"/>
+        </w:rPr>
+        <w:t>ECE (Expected Calibration Error) — measures confidence calibration: ECE = Σ_b (|B_b|/n) · |acc(B_b) − conf(B_b)|. Lower is better.</w:t>
+      </w:r>
+    </w:p>
+    <w:p>
+      <w:pPr>
+        <w:pStyle w:val="ListBullet"/>
+      </w:pPr>
+      <w:r>
+        <w:rPr>
+          <w:sz w:val="22"/>
+        </w:rPr>
+        <w:t>Per-class accuracy — reveals which categories benefit most from pretrained features.</w:t>
+      </w:r>
+    </w:p>
+    <w:p>
+      <w:pPr>
+        <w:pStyle w:val="ListBullet"/>
+      </w:pPr>
+      <w:r>
+        <w:rPr>
+          <w:sz w:val="22"/>
+        </w:rPr>
+        <w:t>Convergence speed — epochs required to first exceed 60%, 70%, 75% accuracy.</w:t>
       </w:r>
     </w:p>
     <w:p>
@@ -1950,7 +2486,7 @@
         <w:jc w:val="left"/>
       </w:pPr>
       <w:r>
-        <w:t>5.1 Final Accuracy</w:t>
+        <w:t>5.1 Accuracy and Calibration</w:t>
       </w:r>
     </w:p>
     <w:tbl>
@@ -1987,24 +2523,7 @@
         </w:tc>
         <w:tc>
           <w:tcPr>
-            <w:tcW w:type="dxa" w:w="2160"/>
-          </w:tcPr>
-          <w:p>
-            <w:pPr>
-              <w:jc w:val="center"/>
-            </w:pPr>
-            <w:r>
-              <w:rPr>
-                <w:b/>
-                <w:sz w:val="20"/>
-              </w:rPr>
-              <w:t>Pretrained</w:t>
-            </w:r>
-          </w:p>
-        </w:tc>
-        <w:tc>
-          <w:tcPr>
-            <w:tcW w:type="dxa" w:w="2880"/>
+            <w:tcW w:type="dxa" w:w="2592"/>
           </w:tcPr>
           <w:p>
             <w:pPr>
@@ -2021,7 +2540,7 @@
         </w:tc>
         <w:tc>
           <w:tcPr>
-            <w:tcW w:type="dxa" w:w="2592"/>
+            <w:tcW w:type="dxa" w:w="2304"/>
           </w:tcPr>
           <w:p>
             <w:pPr>
@@ -2038,7 +2557,7 @@
         </w:tc>
         <w:tc>
           <w:tcPr>
-            <w:tcW w:type="dxa" w:w="2448"/>
+            <w:tcW w:type="dxa" w:w="2160"/>
           </w:tcPr>
           <w:p>
             <w:pPr>
@@ -2053,6 +2572,23 @@
             </w:r>
           </w:p>
         </w:tc>
+        <w:tc>
+          <w:tcPr>
+            <w:tcW w:type="dxa" w:w="1584"/>
+          </w:tcPr>
+          <w:p>
+            <w:pPr>
+              <w:jc w:val="center"/>
+            </w:pPr>
+            <w:r>
+              <w:rPr>
+                <w:b/>
+                <w:sz w:val="20"/>
+              </w:rPr>
+              <w:t>ECE ↓</w:t>
+            </w:r>
+          </w:p>
+        </w:tc>
       </w:tr>
       <w:tr>
         <w:tc>
@@ -2063,25 +2599,25 @@
         </w:tc>
         <w:tc>
           <w:tcPr>
+            <w:tcW w:type="dxa" w:w="2592"/>
+          </w:tcPr>
+          <w:p/>
+        </w:tc>
+        <w:tc>
+          <w:tcPr>
+            <w:tcW w:type="dxa" w:w="2304"/>
+          </w:tcPr>
+          <w:p/>
+        </w:tc>
+        <w:tc>
+          <w:tcPr>
             <w:tcW w:type="dxa" w:w="2160"/>
           </w:tcPr>
           <w:p/>
         </w:tc>
         <w:tc>
           <w:tcPr>
-            <w:tcW w:type="dxa" w:w="2880"/>
-          </w:tcPr>
-          <w:p/>
-        </w:tc>
-        <w:tc>
-          <w:tcPr>
-            <w:tcW w:type="dxa" w:w="2592"/>
-          </w:tcPr>
-          <w:p/>
-        </w:tc>
-        <w:tc>
-          <w:tcPr>
-            <w:tcW w:type="dxa" w:w="2448"/>
+            <w:tcW w:type="dxa" w:w="1584"/>
           </w:tcPr>
           <w:p/>
         </w:tc>
@@ -2095,25 +2631,25 @@
         </w:tc>
         <w:tc>
           <w:tcPr>
+            <w:tcW w:type="dxa" w:w="2592"/>
+          </w:tcPr>
+          <w:p/>
+        </w:tc>
+        <w:tc>
+          <w:tcPr>
+            <w:tcW w:type="dxa" w:w="2304"/>
+          </w:tcPr>
+          <w:p/>
+        </w:tc>
+        <w:tc>
+          <w:tcPr>
             <w:tcW w:type="dxa" w:w="2160"/>
           </w:tcPr>
           <w:p/>
         </w:tc>
         <w:tc>
           <w:tcPr>
-            <w:tcW w:type="dxa" w:w="2880"/>
-          </w:tcPr>
-          <w:p/>
-        </w:tc>
-        <w:tc>
-          <w:tcPr>
-            <w:tcW w:type="dxa" w:w="2592"/>
-          </w:tcPr>
-          <w:p/>
-        </w:tc>
-        <w:tc>
-          <w:tcPr>
-            <w:tcW w:type="dxa" w:w="2448"/>
+            <w:tcW w:type="dxa" w:w="1584"/>
           </w:tcPr>
           <w:p/>
         </w:tc>
@@ -2127,25 +2663,25 @@
         </w:tc>
         <w:tc>
           <w:tcPr>
+            <w:tcW w:type="dxa" w:w="2592"/>
+          </w:tcPr>
+          <w:p/>
+        </w:tc>
+        <w:tc>
+          <w:tcPr>
+            <w:tcW w:type="dxa" w:w="2304"/>
+          </w:tcPr>
+          <w:p/>
+        </w:tc>
+        <w:tc>
+          <w:tcPr>
             <w:tcW w:type="dxa" w:w="2160"/>
           </w:tcPr>
           <w:p/>
         </w:tc>
         <w:tc>
           <w:tcPr>
-            <w:tcW w:type="dxa" w:w="2880"/>
-          </w:tcPr>
-          <w:p/>
-        </w:tc>
-        <w:tc>
-          <w:tcPr>
-            <w:tcW w:type="dxa" w:w="2592"/>
-          </w:tcPr>
-          <w:p/>
-        </w:tc>
-        <w:tc>
-          <w:tcPr>
-            <w:tcW w:type="dxa" w:w="2448"/>
+            <w:tcW w:type="dxa" w:w="1584"/>
           </w:tcPr>
           <w:p/>
         </w:tc>
@@ -2169,23 +2705,7 @@
         </w:tc>
         <w:tc>
           <w:tcPr>
-            <w:tcW w:type="dxa" w:w="2160"/>
-          </w:tcPr>
-          <w:p>
-            <w:pPr>
-              <w:jc w:val="center"/>
-            </w:pPr>
-            <w:r>
-              <w:rPr>
-                <w:sz w:val="20"/>
-              </w:rPr>
-              <w:t>No</w:t>
-            </w:r>
-          </w:p>
-        </w:tc>
-        <w:tc>
-          <w:tcPr>
-            <w:tcW w:type="dxa" w:w="2880"/>
+            <w:tcW w:type="dxa" w:w="2592"/>
           </w:tcPr>
           <w:p>
             <w:pPr>
@@ -2201,7 +2721,7 @@
         </w:tc>
         <w:tc>
           <w:tcPr>
-            <w:tcW w:type="dxa" w:w="2592"/>
+            <w:tcW w:type="dxa" w:w="2304"/>
           </w:tcPr>
           <w:p>
             <w:pPr>
@@ -2217,7 +2737,7 @@
         </w:tc>
         <w:tc>
           <w:tcPr>
-            <w:tcW w:type="dxa" w:w="2448"/>
+            <w:tcW w:type="dxa" w:w="2160"/>
           </w:tcPr>
           <w:p>
             <w:pPr>
@@ -2231,6 +2751,22 @@
             </w:r>
           </w:p>
         </w:tc>
+        <w:tc>
+          <w:tcPr>
+            <w:tcW w:type="dxa" w:w="1584"/>
+          </w:tcPr>
+          <w:p>
+            <w:pPr>
+              <w:jc w:val="center"/>
+            </w:pPr>
+            <w:r>
+              <w:rPr>
+                <w:sz w:val="20"/>
+              </w:rPr>
+              <w:t>0.0843</w:t>
+            </w:r>
+          </w:p>
+        </w:tc>
       </w:tr>
       <w:tr>
         <w:tc>
@@ -2251,23 +2787,7 @@
         </w:tc>
         <w:tc>
           <w:tcPr>
-            <w:tcW w:type="dxa" w:w="2160"/>
-          </w:tcPr>
-          <w:p>
-            <w:pPr>
-              <w:jc w:val="center"/>
-            </w:pPr>
-            <w:r>
-              <w:rPr>
-                <w:sz w:val="20"/>
-              </w:rPr>
-              <w:t>Yes</w:t>
-            </w:r>
-          </w:p>
-        </w:tc>
-        <w:tc>
-          <w:tcPr>
-            <w:tcW w:type="dxa" w:w="2880"/>
+            <w:tcW w:type="dxa" w:w="2592"/>
           </w:tcPr>
           <w:p>
             <w:pPr>
@@ -2283,7 +2803,7 @@
         </w:tc>
         <w:tc>
           <w:tcPr>
-            <w:tcW w:type="dxa" w:w="2592"/>
+            <w:tcW w:type="dxa" w:w="2304"/>
           </w:tcPr>
           <w:p>
             <w:pPr>
@@ -2293,13 +2813,13 @@
               <w:rPr>
                 <w:sz w:val="20"/>
               </w:rPr>
-              <w:t>77.30%</w:t>
+              <w:t>77.26%</w:t>
             </w:r>
           </w:p>
         </w:tc>
         <w:tc>
           <w:tcPr>
-            <w:tcW w:type="dxa" w:w="2448"/>
+            <w:tcW w:type="dxa" w:w="2160"/>
           </w:tcPr>
           <w:p>
             <w:pPr>
@@ -2309,7 +2829,23 @@
               <w:rPr>
                 <w:sz w:val="20"/>
               </w:rPr>
-              <w:t>+6.14 pp</w:t>
+              <w:t>+6.10 pp</w:t>
+            </w:r>
+          </w:p>
+        </w:tc>
+        <w:tc>
+          <w:tcPr>
+            <w:tcW w:type="dxa" w:w="1584"/>
+          </w:tcPr>
+          <w:p>
+            <w:pPr>
+              <w:jc w:val="center"/>
+            </w:pPr>
+            <w:r>
+              <w:rPr>
+                <w:sz w:val="20"/>
+              </w:rPr>
+              <w:t>0.0127</w:t>
             </w:r>
           </w:p>
         </w:tc>
@@ -2333,23 +2869,7 @@
         </w:tc>
         <w:tc>
           <w:tcPr>
-            <w:tcW w:type="dxa" w:w="2160"/>
-          </w:tcPr>
-          <w:p>
-            <w:pPr>
-              <w:jc w:val="center"/>
-            </w:pPr>
-            <w:r>
-              <w:rPr>
-                <w:sz w:val="20"/>
-              </w:rPr>
-              <w:t>Yes</w:t>
-            </w:r>
-          </w:p>
-        </w:tc>
-        <w:tc>
-          <w:tcPr>
-            <w:tcW w:type="dxa" w:w="2880"/>
+            <w:tcW w:type="dxa" w:w="2592"/>
           </w:tcPr>
           <w:p>
             <w:pPr>
@@ -2365,7 +2885,7 @@
         </w:tc>
         <w:tc>
           <w:tcPr>
-            <w:tcW w:type="dxa" w:w="2592"/>
+            <w:tcW w:type="dxa" w:w="2304"/>
           </w:tcPr>
           <w:p>
             <w:pPr>
@@ -2375,13 +2895,13 @@
               <w:rPr>
                 <w:sz w:val="20"/>
               </w:rPr>
-              <w:t>90.55%</w:t>
+              <w:t>90.65%</w:t>
             </w:r>
           </w:p>
         </w:tc>
         <w:tc>
           <w:tcPr>
-            <w:tcW w:type="dxa" w:w="2448"/>
+            <w:tcW w:type="dxa" w:w="2160"/>
           </w:tcPr>
           <w:p>
             <w:pPr>
@@ -2391,7 +2911,23 @@
               <w:rPr>
                 <w:sz w:val="20"/>
               </w:rPr>
-              <w:t>+19.39 pp</w:t>
+              <w:t>+19.49 pp</w:t>
+            </w:r>
+          </w:p>
+        </w:tc>
+        <w:tc>
+          <w:tcPr>
+            <w:tcW w:type="dxa" w:w="1584"/>
+          </w:tcPr>
+          <w:p>
+            <w:pPr>
+              <w:jc w:val="center"/>
+            </w:pPr>
+            <w:r>
+              <w:rPr>
+                <w:sz w:val="20"/>
+              </w:rPr>
+              <w:t>0.0515</w:t>
             </w:r>
           </w:p>
         </w:tc>
@@ -2407,15 +2943,6 @@
         <w:t>5.2 Convergence Speed</w:t>
       </w:r>
     </w:p>
-    <w:p>
-      <w:r>
-        <w:rPr>
-          <w:b w:val="0"/>
-          <w:sz w:val="22"/>
-        </w:rPr>
-        <w:t>Epochs required to first reach 70% validation accuracy:</w:t>
-      </w:r>
-    </w:p>
     <w:tbl>
       <w:tblPr>
         <w:tblStyle w:val="LightGrid-Accent1"/>
@@ -2424,13 +2951,15 @@
         <w:tblLook w:firstColumn="1" w:firstRow="1" w:lastColumn="0" w:lastRow="0" w:noHBand="0" w:noVBand="1" w:val="04A0"/>
       </w:tblPr>
       <w:tblGrid>
-        <w:gridCol w:w="4392"/>
-        <w:gridCol w:w="4392"/>
+        <w:gridCol w:w="2196"/>
+        <w:gridCol w:w="2196"/>
+        <w:gridCol w:w="2196"/>
+        <w:gridCol w:w="2196"/>
       </w:tblGrid>
       <w:tr>
         <w:tc>
           <w:tcPr>
-            <w:tcW w:type="dxa" w:w="5040"/>
+            <w:tcW w:type="dxa" w:w="3168"/>
           </w:tcPr>
           <w:p>
             <w:pPr>
@@ -2447,7 +2976,24 @@
         </w:tc>
         <w:tc>
           <w:tcPr>
-            <w:tcW w:type="dxa" w:w="3600"/>
+            <w:tcW w:type="dxa" w:w="2592"/>
+          </w:tcPr>
+          <w:p>
+            <w:pPr>
+              <w:jc w:val="center"/>
+            </w:pPr>
+            <w:r>
+              <w:rPr>
+                <w:b/>
+                <w:sz w:val="20"/>
+              </w:rPr>
+              <w:t>Epochs to 60%</w:t>
+            </w:r>
+          </w:p>
+        </w:tc>
+        <w:tc>
+          <w:tcPr>
+            <w:tcW w:type="dxa" w:w="2592"/>
           </w:tcPr>
           <w:p>
             <w:pPr>
@@ -2462,17 +3008,46 @@
             </w:r>
           </w:p>
         </w:tc>
+        <w:tc>
+          <w:tcPr>
+            <w:tcW w:type="dxa" w:w="2592"/>
+          </w:tcPr>
+          <w:p>
+            <w:pPr>
+              <w:jc w:val="center"/>
+            </w:pPr>
+            <w:r>
+              <w:rPr>
+                <w:b/>
+                <w:sz w:val="20"/>
+              </w:rPr>
+              <w:t>Epochs to 75%</w:t>
+            </w:r>
+          </w:p>
+        </w:tc>
       </w:tr>
       <w:tr>
         <w:tc>
           <w:tcPr>
-            <w:tcW w:type="dxa" w:w="5040"/>
+            <w:tcW w:type="dxa" w:w="3168"/>
           </w:tcPr>
           <w:p/>
         </w:tc>
         <w:tc>
           <w:tcPr>
-            <w:tcW w:type="dxa" w:w="3600"/>
+            <w:tcW w:type="dxa" w:w="2592"/>
+          </w:tcPr>
+          <w:p/>
+        </w:tc>
+        <w:tc>
+          <w:tcPr>
+            <w:tcW w:type="dxa" w:w="2592"/>
+          </w:tcPr>
+          <w:p/>
+        </w:tc>
+        <w:tc>
+          <w:tcPr>
+            <w:tcW w:type="dxa" w:w="2592"/>
           </w:tcPr>
           <w:p/>
         </w:tc>
@@ -2480,13 +3055,25 @@
       <w:tr>
         <w:tc>
           <w:tcPr>
-            <w:tcW w:type="dxa" w:w="5040"/>
+            <w:tcW w:type="dxa" w:w="3168"/>
           </w:tcPr>
           <w:p/>
         </w:tc>
         <w:tc>
           <w:tcPr>
-            <w:tcW w:type="dxa" w:w="3600"/>
+            <w:tcW w:type="dxa" w:w="2592"/>
+          </w:tcPr>
+          <w:p/>
+        </w:tc>
+        <w:tc>
+          <w:tcPr>
+            <w:tcW w:type="dxa" w:w="2592"/>
+          </w:tcPr>
+          <w:p/>
+        </w:tc>
+        <w:tc>
+          <w:tcPr>
+            <w:tcW w:type="dxa" w:w="2592"/>
           </w:tcPr>
           <w:p/>
         </w:tc>
@@ -2494,13 +3081,25 @@
       <w:tr>
         <w:tc>
           <w:tcPr>
-            <w:tcW w:type="dxa" w:w="5040"/>
+            <w:tcW w:type="dxa" w:w="3168"/>
           </w:tcPr>
           <w:p/>
         </w:tc>
         <w:tc>
           <w:tcPr>
-            <w:tcW w:type="dxa" w:w="3600"/>
+            <w:tcW w:type="dxa" w:w="2592"/>
+          </w:tcPr>
+          <w:p/>
+        </w:tc>
+        <w:tc>
+          <w:tcPr>
+            <w:tcW w:type="dxa" w:w="2592"/>
+          </w:tcPr>
+          <w:p/>
+        </w:tc>
+        <w:tc>
+          <w:tcPr>
+            <w:tcW w:type="dxa" w:w="2592"/>
           </w:tcPr>
           <w:p/>
         </w:tc>
@@ -2508,7 +3107,7 @@
       <w:tr>
         <w:tc>
           <w:tcPr>
-            <w:tcW w:type="dxa" w:w="5040"/>
+            <w:tcW w:type="dxa" w:w="3168"/>
           </w:tcPr>
           <w:p>
             <w:pPr>
@@ -2524,7 +3123,23 @@
         </w:tc>
         <w:tc>
           <w:tcPr>
-            <w:tcW w:type="dxa" w:w="3600"/>
+            <w:tcW w:type="dxa" w:w="2592"/>
+          </w:tcPr>
+          <w:p>
+            <w:pPr>
+              <w:jc w:val="center"/>
+            </w:pPr>
+            <w:r>
+              <w:rPr>
+                <w:sz w:val="20"/>
+              </w:rPr>
+              <w:t>11</w:t>
+            </w:r>
+          </w:p>
+        </w:tc>
+        <w:tc>
+          <w:tcPr>
+            <w:tcW w:type="dxa" w:w="2592"/>
           </w:tcPr>
           <w:p>
             <w:pPr>
@@ -2538,11 +3153,27 @@
             </w:r>
           </w:p>
         </w:tc>
+        <w:tc>
+          <w:tcPr>
+            <w:tcW w:type="dxa" w:w="2592"/>
+          </w:tcPr>
+          <w:p>
+            <w:pPr>
+              <w:jc w:val="center"/>
+            </w:pPr>
+            <w:r>
+              <w:rPr>
+                <w:sz w:val="20"/>
+              </w:rPr>
+              <w:t>&gt;30</w:t>
+            </w:r>
+          </w:p>
+        </w:tc>
       </w:tr>
       <w:tr>
         <w:tc>
           <w:tcPr>
-            <w:tcW w:type="dxa" w:w="5040"/>
+            <w:tcW w:type="dxa" w:w="3168"/>
           </w:tcPr>
           <w:p>
             <w:pPr>
@@ -2558,7 +3189,7 @@
         </w:tc>
         <w:tc>
           <w:tcPr>
-            <w:tcW w:type="dxa" w:w="3600"/>
+            <w:tcW w:type="dxa" w:w="2592"/>
           </w:tcPr>
           <w:p>
             <w:pPr>
@@ -2572,11 +3203,43 @@
             </w:r>
           </w:p>
         </w:tc>
+        <w:tc>
+          <w:tcPr>
+            <w:tcW w:type="dxa" w:w="2592"/>
+          </w:tcPr>
+          <w:p>
+            <w:pPr>
+              <w:jc w:val="center"/>
+            </w:pPr>
+            <w:r>
+              <w:rPr>
+                <w:sz w:val="20"/>
+              </w:rPr>
+              <w:t>1</w:t>
+            </w:r>
+          </w:p>
+        </w:tc>
+        <w:tc>
+          <w:tcPr>
+            <w:tcW w:type="dxa" w:w="2592"/>
+          </w:tcPr>
+          <w:p>
+            <w:pPr>
+              <w:jc w:val="center"/>
+            </w:pPr>
+            <w:r>
+              <w:rPr>
+                <w:sz w:val="20"/>
+              </w:rPr>
+              <w:t>4</w:t>
+            </w:r>
+          </w:p>
+        </w:tc>
       </w:tr>
       <w:tr>
         <w:tc>
           <w:tcPr>
-            <w:tcW w:type="dxa" w:w="5040"/>
+            <w:tcW w:type="dxa" w:w="3168"/>
           </w:tcPr>
           <w:p>
             <w:pPr>
@@ -2592,7 +3255,7 @@
         </w:tc>
         <w:tc>
           <w:tcPr>
-            <w:tcW w:type="dxa" w:w="3600"/>
+            <w:tcW w:type="dxa" w:w="2592"/>
           </w:tcPr>
           <w:p>
             <w:pPr>
@@ -2606,18 +3269,1054 @@
             </w:r>
           </w:p>
         </w:tc>
+        <w:tc>
+          <w:tcPr>
+            <w:tcW w:type="dxa" w:w="2592"/>
+          </w:tcPr>
+          <w:p>
+            <w:pPr>
+              <w:jc w:val="center"/>
+            </w:pPr>
+            <w:r>
+              <w:rPr>
+                <w:sz w:val="20"/>
+              </w:rPr>
+              <w:t>1</w:t>
+            </w:r>
+          </w:p>
+        </w:tc>
+        <w:tc>
+          <w:tcPr>
+            <w:tcW w:type="dxa" w:w="2592"/>
+          </w:tcPr>
+          <w:p>
+            <w:pPr>
+              <w:jc w:val="center"/>
+            </w:pPr>
+            <w:r>
+              <w:rPr>
+                <w:sz w:val="20"/>
+              </w:rPr>
+              <w:t>1</w:t>
+            </w:r>
+          </w:p>
+        </w:tc>
       </w:tr>
     </w:tbl>
     <w:p/>
     <w:p>
+      <w:pPr>
+        <w:pStyle w:val="Heading2"/>
+        <w:jc w:val="left"/>
+      </w:pPr>
       <w:r>
-        <w:rPr>
-          <w:b w:val="0"/>
-          <w:sz w:val="22"/>
-        </w:rPr>
-        <w:t>Pretrained models enter the training loop with high-quality feature representations and therefore need significantly fewer epochs to reach practical performance thresholds — a critical advantage when computational budget is limited.</w:t>
+        <w:t>5.3 Per-class Accuracy</w:t>
       </w:r>
     </w:p>
+    <w:tbl>
+      <w:tblPr>
+        <w:tblStyle w:val="LightGrid-Accent1"/>
+        <w:tblW w:type="auto" w:w="0"/>
+        <w:jc w:val="center"/>
+        <w:tblLook w:firstColumn="1" w:firstRow="1" w:lastColumn="0" w:lastRow="0" w:noHBand="0" w:noVBand="1" w:val="04A0"/>
+      </w:tblPr>
+      <w:tblGrid>
+        <w:gridCol w:w="2196"/>
+        <w:gridCol w:w="2196"/>
+        <w:gridCol w:w="2196"/>
+        <w:gridCol w:w="2196"/>
+      </w:tblGrid>
+      <w:tr>
+        <w:tc>
+          <w:tcPr>
+            <w:tcW w:type="dxa" w:w="2592"/>
+          </w:tcPr>
+          <w:p>
+            <w:pPr>
+              <w:jc w:val="center"/>
+            </w:pPr>
+            <w:r>
+              <w:rPr>
+                <w:b/>
+                <w:sz w:val="20"/>
+              </w:rPr>
+              <w:t>Class</w:t>
+            </w:r>
+          </w:p>
+        </w:tc>
+        <w:tc>
+          <w:tcPr>
+            <w:tcW w:type="dxa" w:w="2304"/>
+          </w:tcPr>
+          <w:p>
+            <w:pPr>
+              <w:jc w:val="center"/>
+            </w:pPr>
+            <w:r>
+              <w:rPr>
+                <w:b/>
+                <w:sz w:val="20"/>
+              </w:rPr>
+              <w:t>Scratch</w:t>
+            </w:r>
+          </w:p>
+        </w:tc>
+        <w:tc>
+          <w:tcPr>
+            <w:tcW w:type="dxa" w:w="3024"/>
+          </w:tcPr>
+          <w:p>
+            <w:pPr>
+              <w:jc w:val="center"/>
+            </w:pPr>
+            <w:r>
+              <w:rPr>
+                <w:b/>
+                <w:sz w:val="20"/>
+              </w:rPr>
+              <w:t>Feature Extraction</w:t>
+            </w:r>
+          </w:p>
+        </w:tc>
+        <w:tc>
+          <w:tcPr>
+            <w:tcW w:type="dxa" w:w="2304"/>
+          </w:tcPr>
+          <w:p>
+            <w:pPr>
+              <w:jc w:val="center"/>
+            </w:pPr>
+            <w:r>
+              <w:rPr>
+                <w:b/>
+                <w:sz w:val="20"/>
+              </w:rPr>
+              <w:t>Fine-tuning</w:t>
+            </w:r>
+          </w:p>
+        </w:tc>
+      </w:tr>
+      <w:tr>
+        <w:tc>
+          <w:tcPr>
+            <w:tcW w:type="dxa" w:w="2592"/>
+          </w:tcPr>
+          <w:p/>
+        </w:tc>
+        <w:tc>
+          <w:tcPr>
+            <w:tcW w:type="dxa" w:w="2304"/>
+          </w:tcPr>
+          <w:p/>
+        </w:tc>
+        <w:tc>
+          <w:tcPr>
+            <w:tcW w:type="dxa" w:w="3024"/>
+          </w:tcPr>
+          <w:p/>
+        </w:tc>
+        <w:tc>
+          <w:tcPr>
+            <w:tcW w:type="dxa" w:w="2304"/>
+          </w:tcPr>
+          <w:p/>
+        </w:tc>
+      </w:tr>
+      <w:tr>
+        <w:tc>
+          <w:tcPr>
+            <w:tcW w:type="dxa" w:w="2592"/>
+          </w:tcPr>
+          <w:p/>
+        </w:tc>
+        <w:tc>
+          <w:tcPr>
+            <w:tcW w:type="dxa" w:w="2304"/>
+          </w:tcPr>
+          <w:p/>
+        </w:tc>
+        <w:tc>
+          <w:tcPr>
+            <w:tcW w:type="dxa" w:w="3024"/>
+          </w:tcPr>
+          <w:p/>
+        </w:tc>
+        <w:tc>
+          <w:tcPr>
+            <w:tcW w:type="dxa" w:w="2304"/>
+          </w:tcPr>
+          <w:p/>
+        </w:tc>
+      </w:tr>
+      <w:tr>
+        <w:tc>
+          <w:tcPr>
+            <w:tcW w:type="dxa" w:w="2592"/>
+          </w:tcPr>
+          <w:p/>
+        </w:tc>
+        <w:tc>
+          <w:tcPr>
+            <w:tcW w:type="dxa" w:w="2304"/>
+          </w:tcPr>
+          <w:p/>
+        </w:tc>
+        <w:tc>
+          <w:tcPr>
+            <w:tcW w:type="dxa" w:w="3024"/>
+          </w:tcPr>
+          <w:p/>
+        </w:tc>
+        <w:tc>
+          <w:tcPr>
+            <w:tcW w:type="dxa" w:w="2304"/>
+          </w:tcPr>
+          <w:p/>
+        </w:tc>
+      </w:tr>
+      <w:tr>
+        <w:tc>
+          <w:tcPr>
+            <w:tcW w:type="dxa" w:w="2592"/>
+          </w:tcPr>
+          <w:p/>
+        </w:tc>
+        <w:tc>
+          <w:tcPr>
+            <w:tcW w:type="dxa" w:w="2304"/>
+          </w:tcPr>
+          <w:p/>
+        </w:tc>
+        <w:tc>
+          <w:tcPr>
+            <w:tcW w:type="dxa" w:w="3024"/>
+          </w:tcPr>
+          <w:p/>
+        </w:tc>
+        <w:tc>
+          <w:tcPr>
+            <w:tcW w:type="dxa" w:w="2304"/>
+          </w:tcPr>
+          <w:p/>
+        </w:tc>
+      </w:tr>
+      <w:tr>
+        <w:tc>
+          <w:tcPr>
+            <w:tcW w:type="dxa" w:w="2592"/>
+          </w:tcPr>
+          <w:p/>
+        </w:tc>
+        <w:tc>
+          <w:tcPr>
+            <w:tcW w:type="dxa" w:w="2304"/>
+          </w:tcPr>
+          <w:p/>
+        </w:tc>
+        <w:tc>
+          <w:tcPr>
+            <w:tcW w:type="dxa" w:w="3024"/>
+          </w:tcPr>
+          <w:p/>
+        </w:tc>
+        <w:tc>
+          <w:tcPr>
+            <w:tcW w:type="dxa" w:w="2304"/>
+          </w:tcPr>
+          <w:p/>
+        </w:tc>
+      </w:tr>
+      <w:tr>
+        <w:tc>
+          <w:tcPr>
+            <w:tcW w:type="dxa" w:w="2592"/>
+          </w:tcPr>
+          <w:p/>
+        </w:tc>
+        <w:tc>
+          <w:tcPr>
+            <w:tcW w:type="dxa" w:w="2304"/>
+          </w:tcPr>
+          <w:p/>
+        </w:tc>
+        <w:tc>
+          <w:tcPr>
+            <w:tcW w:type="dxa" w:w="3024"/>
+          </w:tcPr>
+          <w:p/>
+        </w:tc>
+        <w:tc>
+          <w:tcPr>
+            <w:tcW w:type="dxa" w:w="2304"/>
+          </w:tcPr>
+          <w:p/>
+        </w:tc>
+      </w:tr>
+      <w:tr>
+        <w:tc>
+          <w:tcPr>
+            <w:tcW w:type="dxa" w:w="2592"/>
+          </w:tcPr>
+          <w:p/>
+        </w:tc>
+        <w:tc>
+          <w:tcPr>
+            <w:tcW w:type="dxa" w:w="2304"/>
+          </w:tcPr>
+          <w:p/>
+        </w:tc>
+        <w:tc>
+          <w:tcPr>
+            <w:tcW w:type="dxa" w:w="3024"/>
+          </w:tcPr>
+          <w:p/>
+        </w:tc>
+        <w:tc>
+          <w:tcPr>
+            <w:tcW w:type="dxa" w:w="2304"/>
+          </w:tcPr>
+          <w:p/>
+        </w:tc>
+      </w:tr>
+      <w:tr>
+        <w:tc>
+          <w:tcPr>
+            <w:tcW w:type="dxa" w:w="2592"/>
+          </w:tcPr>
+          <w:p/>
+        </w:tc>
+        <w:tc>
+          <w:tcPr>
+            <w:tcW w:type="dxa" w:w="2304"/>
+          </w:tcPr>
+          <w:p/>
+        </w:tc>
+        <w:tc>
+          <w:tcPr>
+            <w:tcW w:type="dxa" w:w="3024"/>
+          </w:tcPr>
+          <w:p/>
+        </w:tc>
+        <w:tc>
+          <w:tcPr>
+            <w:tcW w:type="dxa" w:w="2304"/>
+          </w:tcPr>
+          <w:p/>
+        </w:tc>
+      </w:tr>
+      <w:tr>
+        <w:tc>
+          <w:tcPr>
+            <w:tcW w:type="dxa" w:w="2592"/>
+          </w:tcPr>
+          <w:p/>
+        </w:tc>
+        <w:tc>
+          <w:tcPr>
+            <w:tcW w:type="dxa" w:w="2304"/>
+          </w:tcPr>
+          <w:p/>
+        </w:tc>
+        <w:tc>
+          <w:tcPr>
+            <w:tcW w:type="dxa" w:w="3024"/>
+          </w:tcPr>
+          <w:p/>
+        </w:tc>
+        <w:tc>
+          <w:tcPr>
+            <w:tcW w:type="dxa" w:w="2304"/>
+          </w:tcPr>
+          <w:p/>
+        </w:tc>
+      </w:tr>
+      <w:tr>
+        <w:tc>
+          <w:tcPr>
+            <w:tcW w:type="dxa" w:w="2592"/>
+          </w:tcPr>
+          <w:p/>
+        </w:tc>
+        <w:tc>
+          <w:tcPr>
+            <w:tcW w:type="dxa" w:w="2304"/>
+          </w:tcPr>
+          <w:p/>
+        </w:tc>
+        <w:tc>
+          <w:tcPr>
+            <w:tcW w:type="dxa" w:w="3024"/>
+          </w:tcPr>
+          <w:p/>
+        </w:tc>
+        <w:tc>
+          <w:tcPr>
+            <w:tcW w:type="dxa" w:w="2304"/>
+          </w:tcPr>
+          <w:p/>
+        </w:tc>
+      </w:tr>
+      <w:tr>
+        <w:tc>
+          <w:tcPr>
+            <w:tcW w:type="dxa" w:w="2592"/>
+          </w:tcPr>
+          <w:p>
+            <w:pPr>
+              <w:jc w:val="center"/>
+            </w:pPr>
+            <w:r>
+              <w:rPr>
+                <w:sz w:val="20"/>
+              </w:rPr>
+              <w:t>airplane</w:t>
+            </w:r>
+          </w:p>
+        </w:tc>
+        <w:tc>
+          <w:tcPr>
+            <w:tcW w:type="dxa" w:w="2304"/>
+          </w:tcPr>
+          <w:p>
+            <w:pPr>
+              <w:jc w:val="center"/>
+            </w:pPr>
+            <w:r>
+              <w:rPr>
+                <w:sz w:val="20"/>
+              </w:rPr>
+              <w:t>82.8%</w:t>
+            </w:r>
+          </w:p>
+        </w:tc>
+        <w:tc>
+          <w:tcPr>
+            <w:tcW w:type="dxa" w:w="3024"/>
+          </w:tcPr>
+          <w:p>
+            <w:pPr>
+              <w:jc w:val="center"/>
+            </w:pPr>
+            <w:r>
+              <w:rPr>
+                <w:sz w:val="20"/>
+              </w:rPr>
+              <w:t>83.5%</w:t>
+            </w:r>
+          </w:p>
+        </w:tc>
+        <w:tc>
+          <w:tcPr>
+            <w:tcW w:type="dxa" w:w="2304"/>
+          </w:tcPr>
+          <w:p>
+            <w:pPr>
+              <w:jc w:val="center"/>
+            </w:pPr>
+            <w:r>
+              <w:rPr>
+                <w:sz w:val="20"/>
+              </w:rPr>
+              <w:t>94.2%</w:t>
+            </w:r>
+          </w:p>
+        </w:tc>
+      </w:tr>
+      <w:tr>
+        <w:tc>
+          <w:tcPr>
+            <w:tcW w:type="dxa" w:w="2592"/>
+          </w:tcPr>
+          <w:p>
+            <w:pPr>
+              <w:jc w:val="center"/>
+            </w:pPr>
+            <w:r>
+              <w:rPr>
+                <w:sz w:val="20"/>
+              </w:rPr>
+              <w:t>bird</w:t>
+            </w:r>
+          </w:p>
+        </w:tc>
+        <w:tc>
+          <w:tcPr>
+            <w:tcW w:type="dxa" w:w="2304"/>
+          </w:tcPr>
+          <w:p>
+            <w:pPr>
+              <w:jc w:val="center"/>
+            </w:pPr>
+            <w:r>
+              <w:rPr>
+                <w:sz w:val="20"/>
+              </w:rPr>
+              <w:t>71.4%</w:t>
+            </w:r>
+          </w:p>
+        </w:tc>
+        <w:tc>
+          <w:tcPr>
+            <w:tcW w:type="dxa" w:w="3024"/>
+          </w:tcPr>
+          <w:p>
+            <w:pPr>
+              <w:jc w:val="center"/>
+            </w:pPr>
+            <w:r>
+              <w:rPr>
+                <w:sz w:val="20"/>
+              </w:rPr>
+              <w:t>79.1%</w:t>
+            </w:r>
+          </w:p>
+        </w:tc>
+        <w:tc>
+          <w:tcPr>
+            <w:tcW w:type="dxa" w:w="2304"/>
+          </w:tcPr>
+          <w:p>
+            <w:pPr>
+              <w:jc w:val="center"/>
+            </w:pPr>
+            <w:r>
+              <w:rPr>
+                <w:sz w:val="20"/>
+              </w:rPr>
+              <w:t>94.8%</w:t>
+            </w:r>
+          </w:p>
+        </w:tc>
+      </w:tr>
+      <w:tr>
+        <w:tc>
+          <w:tcPr>
+            <w:tcW w:type="dxa" w:w="2592"/>
+          </w:tcPr>
+          <w:p>
+            <w:pPr>
+              <w:jc w:val="center"/>
+            </w:pPr>
+            <w:r>
+              <w:rPr>
+                <w:sz w:val="20"/>
+              </w:rPr>
+              <w:t>car</w:t>
+            </w:r>
+          </w:p>
+        </w:tc>
+        <w:tc>
+          <w:tcPr>
+            <w:tcW w:type="dxa" w:w="2304"/>
+          </w:tcPr>
+          <w:p>
+            <w:pPr>
+              <w:jc w:val="center"/>
+            </w:pPr>
+            <w:r>
+              <w:rPr>
+                <w:sz w:val="20"/>
+              </w:rPr>
+              <w:t>77.6%</w:t>
+            </w:r>
+          </w:p>
+        </w:tc>
+        <w:tc>
+          <w:tcPr>
+            <w:tcW w:type="dxa" w:w="3024"/>
+          </w:tcPr>
+          <w:p>
+            <w:pPr>
+              <w:jc w:val="center"/>
+            </w:pPr>
+            <w:r>
+              <w:rPr>
+                <w:sz w:val="20"/>
+              </w:rPr>
+              <w:t>89.2%</w:t>
+            </w:r>
+          </w:p>
+        </w:tc>
+        <w:tc>
+          <w:tcPr>
+            <w:tcW w:type="dxa" w:w="2304"/>
+          </w:tcPr>
+          <w:p>
+            <w:pPr>
+              <w:jc w:val="center"/>
+            </w:pPr>
+            <w:r>
+              <w:rPr>
+                <w:sz w:val="20"/>
+              </w:rPr>
+              <w:t>93.1%</w:t>
+            </w:r>
+          </w:p>
+        </w:tc>
+      </w:tr>
+      <w:tr>
+        <w:tc>
+          <w:tcPr>
+            <w:tcW w:type="dxa" w:w="2592"/>
+          </w:tcPr>
+          <w:p>
+            <w:pPr>
+              <w:jc w:val="center"/>
+            </w:pPr>
+            <w:r>
+              <w:rPr>
+                <w:sz w:val="20"/>
+              </w:rPr>
+              <w:t>cat</w:t>
+            </w:r>
+          </w:p>
+        </w:tc>
+        <w:tc>
+          <w:tcPr>
+            <w:tcW w:type="dxa" w:w="2304"/>
+          </w:tcPr>
+          <w:p>
+            <w:pPr>
+              <w:jc w:val="center"/>
+            </w:pPr>
+            <w:r>
+              <w:rPr>
+                <w:sz w:val="20"/>
+              </w:rPr>
+              <w:t>54.4%</w:t>
+            </w:r>
+          </w:p>
+        </w:tc>
+        <w:tc>
+          <w:tcPr>
+            <w:tcW w:type="dxa" w:w="3024"/>
+          </w:tcPr>
+          <w:p>
+            <w:pPr>
+              <w:jc w:val="center"/>
+            </w:pPr>
+            <w:r>
+              <w:rPr>
+                <w:sz w:val="20"/>
+              </w:rPr>
+              <w:t>62.0%</w:t>
+            </w:r>
+          </w:p>
+        </w:tc>
+        <w:tc>
+          <w:tcPr>
+            <w:tcW w:type="dxa" w:w="2304"/>
+          </w:tcPr>
+          <w:p>
+            <w:pPr>
+              <w:jc w:val="center"/>
+            </w:pPr>
+            <w:r>
+              <w:rPr>
+                <w:sz w:val="20"/>
+              </w:rPr>
+              <w:t>82.2%</w:t>
+            </w:r>
+          </w:p>
+        </w:tc>
+      </w:tr>
+      <w:tr>
+        <w:tc>
+          <w:tcPr>
+            <w:tcW w:type="dxa" w:w="2592"/>
+          </w:tcPr>
+          <w:p>
+            <w:pPr>
+              <w:jc w:val="center"/>
+            </w:pPr>
+            <w:r>
+              <w:rPr>
+                <w:sz w:val="20"/>
+              </w:rPr>
+              <w:t>deer</w:t>
+            </w:r>
+          </w:p>
+        </w:tc>
+        <w:tc>
+          <w:tcPr>
+            <w:tcW w:type="dxa" w:w="2304"/>
+          </w:tcPr>
+          <w:p>
+            <w:pPr>
+              <w:jc w:val="center"/>
+            </w:pPr>
+            <w:r>
+              <w:rPr>
+                <w:sz w:val="20"/>
+              </w:rPr>
+              <w:t>62.5%</w:t>
+            </w:r>
+          </w:p>
+        </w:tc>
+        <w:tc>
+          <w:tcPr>
+            <w:tcW w:type="dxa" w:w="3024"/>
+          </w:tcPr>
+          <w:p>
+            <w:pPr>
+              <w:jc w:val="center"/>
+            </w:pPr>
+            <w:r>
+              <w:rPr>
+                <w:sz w:val="20"/>
+              </w:rPr>
+              <w:t>75.8%</w:t>
+            </w:r>
+          </w:p>
+        </w:tc>
+        <w:tc>
+          <w:tcPr>
+            <w:tcW w:type="dxa" w:w="2304"/>
+          </w:tcPr>
+          <w:p>
+            <w:pPr>
+              <w:jc w:val="center"/>
+            </w:pPr>
+            <w:r>
+              <w:rPr>
+                <w:sz w:val="20"/>
+              </w:rPr>
+              <w:t>88.9%</w:t>
+            </w:r>
+          </w:p>
+        </w:tc>
+      </w:tr>
+      <w:tr>
+        <w:tc>
+          <w:tcPr>
+            <w:tcW w:type="dxa" w:w="2592"/>
+          </w:tcPr>
+          <w:p>
+            <w:pPr>
+              <w:jc w:val="center"/>
+            </w:pPr>
+            <w:r>
+              <w:rPr>
+                <w:sz w:val="20"/>
+              </w:rPr>
+              <w:t>dog</w:t>
+            </w:r>
+          </w:p>
+        </w:tc>
+        <w:tc>
+          <w:tcPr>
+            <w:tcW w:type="dxa" w:w="2304"/>
+          </w:tcPr>
+          <w:p>
+            <w:pPr>
+              <w:jc w:val="center"/>
+            </w:pPr>
+            <w:r>
+              <w:rPr>
+                <w:sz w:val="20"/>
+              </w:rPr>
+              <w:t>57.2%</w:t>
+            </w:r>
+          </w:p>
+        </w:tc>
+        <w:tc>
+          <w:tcPr>
+            <w:tcW w:type="dxa" w:w="3024"/>
+          </w:tcPr>
+          <w:p>
+            <w:pPr>
+              <w:jc w:val="center"/>
+            </w:pPr>
+            <w:r>
+              <w:rPr>
+                <w:sz w:val="20"/>
+              </w:rPr>
+              <w:t>72.1%</w:t>
+            </w:r>
+          </w:p>
+        </w:tc>
+        <w:tc>
+          <w:tcPr>
+            <w:tcW w:type="dxa" w:w="2304"/>
+          </w:tcPr>
+          <w:p>
+            <w:pPr>
+              <w:jc w:val="center"/>
+            </w:pPr>
+            <w:r>
+              <w:rPr>
+                <w:sz w:val="20"/>
+              </w:rPr>
+              <w:t>86.1%</w:t>
+            </w:r>
+          </w:p>
+        </w:tc>
+      </w:tr>
+      <w:tr>
+        <w:tc>
+          <w:tcPr>
+            <w:tcW w:type="dxa" w:w="2592"/>
+          </w:tcPr>
+          <w:p>
+            <w:pPr>
+              <w:jc w:val="center"/>
+            </w:pPr>
+            <w:r>
+              <w:rPr>
+                <w:sz w:val="20"/>
+              </w:rPr>
+              <w:t>horse</w:t>
+            </w:r>
+          </w:p>
+        </w:tc>
+        <w:tc>
+          <w:tcPr>
+            <w:tcW w:type="dxa" w:w="2304"/>
+          </w:tcPr>
+          <w:p>
+            <w:pPr>
+              <w:jc w:val="center"/>
+            </w:pPr>
+            <w:r>
+              <w:rPr>
+                <w:sz w:val="20"/>
+              </w:rPr>
+              <w:t>74.2%</w:t>
+            </w:r>
+          </w:p>
+        </w:tc>
+        <w:tc>
+          <w:tcPr>
+            <w:tcW w:type="dxa" w:w="3024"/>
+          </w:tcPr>
+          <w:p>
+            <w:pPr>
+              <w:jc w:val="center"/>
+            </w:pPr>
+            <w:r>
+              <w:rPr>
+                <w:sz w:val="20"/>
+              </w:rPr>
+              <w:t>76.5%</w:t>
+            </w:r>
+          </w:p>
+        </w:tc>
+        <w:tc>
+          <w:tcPr>
+            <w:tcW w:type="dxa" w:w="2304"/>
+          </w:tcPr>
+          <w:p>
+            <w:pPr>
+              <w:jc w:val="center"/>
+            </w:pPr>
+            <w:r>
+              <w:rPr>
+                <w:sz w:val="20"/>
+              </w:rPr>
+              <w:t>90.5%</w:t>
+            </w:r>
+          </w:p>
+        </w:tc>
+      </w:tr>
+      <w:tr>
+        <w:tc>
+          <w:tcPr>
+            <w:tcW w:type="dxa" w:w="2592"/>
+          </w:tcPr>
+          <w:p>
+            <w:pPr>
+              <w:jc w:val="center"/>
+            </w:pPr>
+            <w:r>
+              <w:rPr>
+                <w:sz w:val="20"/>
+              </w:rPr>
+              <w:t>monkey</w:t>
+            </w:r>
+          </w:p>
+        </w:tc>
+        <w:tc>
+          <w:tcPr>
+            <w:tcW w:type="dxa" w:w="2304"/>
+          </w:tcPr>
+          <w:p>
+            <w:pPr>
+              <w:jc w:val="center"/>
+            </w:pPr>
+            <w:r>
+              <w:rPr>
+                <w:sz w:val="20"/>
+              </w:rPr>
+              <w:t>70.5%</w:t>
+            </w:r>
+          </w:p>
+        </w:tc>
+        <w:tc>
+          <w:tcPr>
+            <w:tcW w:type="dxa" w:w="3024"/>
+          </w:tcPr>
+          <w:p>
+            <w:pPr>
+              <w:jc w:val="center"/>
+            </w:pPr>
+            <w:r>
+              <w:rPr>
+                <w:sz w:val="20"/>
+              </w:rPr>
+              <w:t>76.1%</w:t>
+            </w:r>
+          </w:p>
+        </w:tc>
+        <w:tc>
+          <w:tcPr>
+            <w:tcW w:type="dxa" w:w="2304"/>
+          </w:tcPr>
+          <w:p>
+            <w:pPr>
+              <w:jc w:val="center"/>
+            </w:pPr>
+            <w:r>
+              <w:rPr>
+                <w:sz w:val="20"/>
+              </w:rPr>
+              <w:t>91.2%</w:t>
+            </w:r>
+          </w:p>
+        </w:tc>
+      </w:tr>
+      <w:tr>
+        <w:tc>
+          <w:tcPr>
+            <w:tcW w:type="dxa" w:w="2592"/>
+          </w:tcPr>
+          <w:p>
+            <w:pPr>
+              <w:jc w:val="center"/>
+            </w:pPr>
+            <w:r>
+              <w:rPr>
+                <w:sz w:val="20"/>
+              </w:rPr>
+              <w:t>ship</w:t>
+            </w:r>
+          </w:p>
+        </w:tc>
+        <w:tc>
+          <w:tcPr>
+            <w:tcW w:type="dxa" w:w="2304"/>
+          </w:tcPr>
+          <w:p>
+            <w:pPr>
+              <w:jc w:val="center"/>
+            </w:pPr>
+            <w:r>
+              <w:rPr>
+                <w:sz w:val="20"/>
+              </w:rPr>
+              <w:t>85.1%</w:t>
+            </w:r>
+          </w:p>
+        </w:tc>
+        <w:tc>
+          <w:tcPr>
+            <w:tcW w:type="dxa" w:w="3024"/>
+          </w:tcPr>
+          <w:p>
+            <w:pPr>
+              <w:jc w:val="center"/>
+            </w:pPr>
+            <w:r>
+              <w:rPr>
+                <w:sz w:val="20"/>
+              </w:rPr>
+              <w:t>82.6%</w:t>
+            </w:r>
+          </w:p>
+        </w:tc>
+        <w:tc>
+          <w:tcPr>
+            <w:tcW w:type="dxa" w:w="2304"/>
+          </w:tcPr>
+          <w:p>
+            <w:pPr>
+              <w:jc w:val="center"/>
+            </w:pPr>
+            <w:r>
+              <w:rPr>
+                <w:sz w:val="20"/>
+              </w:rPr>
+              <w:t>95.8%</w:t>
+            </w:r>
+          </w:p>
+        </w:tc>
+      </w:tr>
+      <w:tr>
+        <w:tc>
+          <w:tcPr>
+            <w:tcW w:type="dxa" w:w="2592"/>
+          </w:tcPr>
+          <w:p>
+            <w:pPr>
+              <w:jc w:val="center"/>
+            </w:pPr>
+            <w:r>
+              <w:rPr>
+                <w:sz w:val="20"/>
+              </w:rPr>
+              <w:t>truck</w:t>
+            </w:r>
+          </w:p>
+        </w:tc>
+        <w:tc>
+          <w:tcPr>
+            <w:tcW w:type="dxa" w:w="2304"/>
+          </w:tcPr>
+          <w:p>
+            <w:pPr>
+              <w:jc w:val="center"/>
+            </w:pPr>
+            <w:r>
+              <w:rPr>
+                <w:sz w:val="20"/>
+              </w:rPr>
+              <w:t>75.9%</w:t>
+            </w:r>
+          </w:p>
+        </w:tc>
+        <w:tc>
+          <w:tcPr>
+            <w:tcW w:type="dxa" w:w="3024"/>
+          </w:tcPr>
+          <w:p>
+            <w:pPr>
+              <w:jc w:val="center"/>
+            </w:pPr>
+            <w:r>
+              <w:rPr>
+                <w:sz w:val="20"/>
+              </w:rPr>
+              <w:t>75.6%</w:t>
+            </w:r>
+          </w:p>
+        </w:tc>
+        <w:tc>
+          <w:tcPr>
+            <w:tcW w:type="dxa" w:w="2304"/>
+          </w:tcPr>
+          <w:p>
+            <w:pPr>
+              <w:jc w:val="center"/>
+            </w:pPr>
+            <w:r>
+              <w:rPr>
+                <w:sz w:val="20"/>
+              </w:rPr>
+              <w:t>89.6%</w:t>
+            </w:r>
+          </w:p>
+        </w:tc>
+      </w:tr>
+    </w:tbl>
     <w:p>
       <w:pPr>
         <w:pStyle w:val="Heading1"/>
@@ -2633,7 +4332,7 @@
         <w:jc w:val="left"/>
       </w:pPr>
       <w:r>
-        <w:t>6.1 Accuracy &amp; Loss Curves</w:t>
+        <w:t>6.1 Learning Curves</w:t>
       </w:r>
     </w:p>
     <w:p>
@@ -2684,7 +4383,7 @@
           <w:i/>
           <w:sz w:val="20"/>
         </w:rPr>
-        <w:t>Figure 2: Validation accuracy (left) and training loss (right) over 30 epochs</w:t>
+        <w:t>Figure 2: Validation accuracy (left) and training loss (right) over 30 epochs.</w:t>
       </w:r>
     </w:p>
     <w:p/>
@@ -2745,7 +4444,7 @@
           <w:i/>
           <w:sz w:val="20"/>
         </w:rPr>
-        <w:t>Figure 3: Best test accuracy achieved by each training strategy</w:t>
+        <w:t>Figure 3: Best test accuracy for each training strategy.</w:t>
       </w:r>
     </w:p>
     <w:p/>
@@ -2755,7 +4454,7 @@
         <w:jc w:val="left"/>
       </w:pPr>
       <w:r>
-        <w:t>6.3 Convergence Speed (First 10 Epochs)</w:t>
+        <w:t>6.3 Convergence Speed — First 10 Epochs</w:t>
       </w:r>
     </w:p>
     <w:p>
@@ -2806,7 +4505,7 @@
           <w:i/>
           <w:sz w:val="20"/>
         </w:rPr>
-        <w:t>Figure 4: Validation accuracy in the first 10 epochs. Pretrained models achieve high accuracy immediately; scratch training starts low.</w:t>
+        <w:t>Figure 4: Validation accuracy in the first 10 epochs. Fine-tuning immediately achieves high accuracy; scratch training starts near chance level.</w:t>
       </w:r>
     </w:p>
     <w:p/>
@@ -2816,7 +4515,7 @@
         <w:jc w:val="left"/>
       </w:pPr>
       <w:r>
-        <w:t>6.4 Training vs Validation (Overfitting Check)</w:t>
+        <w:t>6.4 Overfitting Analysis</w:t>
       </w:r>
     </w:p>
     <w:p>
@@ -2867,7 +4566,233 @@
           <w:i/>
           <w:sz w:val="20"/>
         </w:rPr>
-        <w:t>Figure 5: Train vs validation accuracy for each condition. Feature Extraction shows the smallest generalisation gap due to frozen backbone.</w:t>
+        <w:t>Figure 5: Training vs validation accuracy per condition. Feature Extraction has the smallest generalisation gap; Fine-tuning shows larger gap due to full model capacity on small data.</w:t>
+      </w:r>
+    </w:p>
+    <w:p/>
+    <w:p>
+      <w:pPr>
+        <w:pStyle w:val="Heading2"/>
+        <w:jc w:val="left"/>
+      </w:pPr>
+      <w:r>
+        <w:t>6.5 Confusion Matrices (Best Weights)</w:t>
+      </w:r>
+    </w:p>
+    <w:p>
+      <w:pPr>
+        <w:jc w:val="center"/>
+      </w:pPr>
+      <w:r>
+        <w:drawing>
+          <wp:inline xmlns:a="http://schemas.openxmlformats.org/drawingml/2006/main" xmlns:pic="http://schemas.openxmlformats.org/drawingml/2006/picture">
+            <wp:extent cx="4754880" cy="4411567"/>
+            <wp:docPr id="6" name="Picture 6"/>
+            <wp:cNvGraphicFramePr>
+              <a:graphicFrameLocks noChangeAspect="1"/>
+            </wp:cNvGraphicFramePr>
+            <a:graphic>
+              <a:graphicData uri="http://schemas.openxmlformats.org/drawingml/2006/picture">
+                <pic:pic>
+                  <pic:nvPicPr>
+                    <pic:cNvPr id="0" name="tl_cm_scratch.png"/>
+                    <pic:cNvPicPr/>
+                  </pic:nvPicPr>
+                  <pic:blipFill>
+                    <a:blip r:embed="rId14"/>
+                    <a:stretch>
+                      <a:fillRect/>
+                    </a:stretch>
+                  </pic:blipFill>
+                  <pic:spPr>
+                    <a:xfrm>
+                      <a:off x="0" y="0"/>
+                      <a:ext cx="4754880" cy="4411567"/>
+                    </a:xfrm>
+                    <a:prstGeom prst="rect"/>
+                  </pic:spPr>
+                </pic:pic>
+              </a:graphicData>
+            </a:graphic>
+          </wp:inline>
+        </w:drawing>
+      </w:r>
+    </w:p>
+    <w:p>
+      <w:pPr>
+        <w:jc w:val="center"/>
+      </w:pPr>
+      <w:r>
+        <w:rPr>
+          <w:i/>
+          <w:sz w:val="20"/>
+        </w:rPr>
+        <w:t>Figure: Confusion matrix — From Scratch (best class: 85.1%, hardest class: cat 54.4%)</w:t>
+      </w:r>
+    </w:p>
+    <w:p/>
+    <w:p>
+      <w:pPr>
+        <w:jc w:val="center"/>
+      </w:pPr>
+      <w:r>
+        <w:drawing>
+          <wp:inline xmlns:a="http://schemas.openxmlformats.org/drawingml/2006/main" xmlns:pic="http://schemas.openxmlformats.org/drawingml/2006/picture">
+            <wp:extent cx="4754880" cy="4411567"/>
+            <wp:docPr id="7" name="Picture 7"/>
+            <wp:cNvGraphicFramePr>
+              <a:graphicFrameLocks noChangeAspect="1"/>
+            </wp:cNvGraphicFramePr>
+            <a:graphic>
+              <a:graphicData uri="http://schemas.openxmlformats.org/drawingml/2006/picture">
+                <pic:pic>
+                  <pic:nvPicPr>
+                    <pic:cNvPr id="0" name="tl_cm_feature_extract.png"/>
+                    <pic:cNvPicPr/>
+                  </pic:nvPicPr>
+                  <pic:blipFill>
+                    <a:blip r:embed="rId15"/>
+                    <a:stretch>
+                      <a:fillRect/>
+                    </a:stretch>
+                  </pic:blipFill>
+                  <pic:spPr>
+                    <a:xfrm>
+                      <a:off x="0" y="0"/>
+                      <a:ext cx="4754880" cy="4411567"/>
+                    </a:xfrm>
+                    <a:prstGeom prst="rect"/>
+                  </pic:spPr>
+                </pic:pic>
+              </a:graphicData>
+            </a:graphic>
+          </wp:inline>
+        </w:drawing>
+      </w:r>
+    </w:p>
+    <w:p>
+      <w:pPr>
+        <w:jc w:val="center"/>
+      </w:pPr>
+      <w:r>
+        <w:rPr>
+          <w:i/>
+          <w:sz w:val="20"/>
+        </w:rPr>
+        <w:t>Figure: Confusion matrix — Feature Extraction (best class: 89.2%, hardest class: cat 62.0%)</w:t>
+      </w:r>
+    </w:p>
+    <w:p/>
+    <w:p>
+      <w:pPr>
+        <w:jc w:val="center"/>
+      </w:pPr>
+      <w:r>
+        <w:drawing>
+          <wp:inline xmlns:a="http://schemas.openxmlformats.org/drawingml/2006/main" xmlns:pic="http://schemas.openxmlformats.org/drawingml/2006/picture">
+            <wp:extent cx="4754880" cy="4411567"/>
+            <wp:docPr id="8" name="Picture 8"/>
+            <wp:cNvGraphicFramePr>
+              <a:graphicFrameLocks noChangeAspect="1"/>
+            </wp:cNvGraphicFramePr>
+            <a:graphic>
+              <a:graphicData uri="http://schemas.openxmlformats.org/drawingml/2006/picture">
+                <pic:pic>
+                  <pic:nvPicPr>
+                    <pic:cNvPr id="0" name="tl_cm_finetune.png"/>
+                    <pic:cNvPicPr/>
+                  </pic:nvPicPr>
+                  <pic:blipFill>
+                    <a:blip r:embed="rId16"/>
+                    <a:stretch>
+                      <a:fillRect/>
+                    </a:stretch>
+                  </pic:blipFill>
+                  <pic:spPr>
+                    <a:xfrm>
+                      <a:off x="0" y="0"/>
+                      <a:ext cx="4754880" cy="4411567"/>
+                    </a:xfrm>
+                    <a:prstGeom prst="rect"/>
+                  </pic:spPr>
+                </pic:pic>
+              </a:graphicData>
+            </a:graphic>
+          </wp:inline>
+        </w:drawing>
+      </w:r>
+    </w:p>
+    <w:p>
+      <w:pPr>
+        <w:jc w:val="center"/>
+      </w:pPr>
+      <w:r>
+        <w:rPr>
+          <w:i/>
+          <w:sz w:val="20"/>
+        </w:rPr>
+        <w:t>Figure: Confusion matrix — Fine-tuning (best class: 95.8%, hardest class: cat 82.2%)</w:t>
+      </w:r>
+    </w:p>
+    <w:p/>
+    <w:p>
+      <w:pPr>
+        <w:pStyle w:val="Heading2"/>
+        <w:jc w:val="left"/>
+      </w:pPr>
+      <w:r>
+        <w:t>6.6 Per-class Accuracy</w:t>
+      </w:r>
+    </w:p>
+    <w:p>
+      <w:pPr>
+        <w:jc w:val="center"/>
+      </w:pPr>
+      <w:r>
+        <w:drawing>
+          <wp:inline xmlns:a="http://schemas.openxmlformats.org/drawingml/2006/main" xmlns:pic="http://schemas.openxmlformats.org/drawingml/2006/picture">
+            <wp:extent cx="5486400" cy="2238845"/>
+            <wp:docPr id="9" name="Picture 9"/>
+            <wp:cNvGraphicFramePr>
+              <a:graphicFrameLocks noChangeAspect="1"/>
+            </wp:cNvGraphicFramePr>
+            <a:graphic>
+              <a:graphicData uri="http://schemas.openxmlformats.org/drawingml/2006/picture">
+                <pic:pic>
+                  <pic:nvPicPr>
+                    <pic:cNvPr id="0" name="tl_per_class_acc.png"/>
+                    <pic:cNvPicPr/>
+                  </pic:nvPicPr>
+                  <pic:blipFill>
+                    <a:blip r:embed="rId17"/>
+                    <a:stretch>
+                      <a:fillRect/>
+                    </a:stretch>
+                  </pic:blipFill>
+                  <pic:spPr>
+                    <a:xfrm>
+                      <a:off x="0" y="0"/>
+                      <a:ext cx="5486400" cy="2238845"/>
+                    </a:xfrm>
+                    <a:prstGeom prst="rect"/>
+                  </pic:spPr>
+                </pic:pic>
+              </a:graphicData>
+            </a:graphic>
+          </wp:inline>
+        </w:drawing>
+      </w:r>
+    </w:p>
+    <w:p>
+      <w:pPr>
+        <w:jc w:val="center"/>
+      </w:pPr>
+      <w:r>
+        <w:rPr>
+          <w:i/>
+          <w:sz w:val="20"/>
+        </w:rPr>
+        <w:t>Figure 6: Per-class accuracy for all three conditions. Fine-tuning consistently outperforms across all categories; Feature Extraction provides a partial benefit over scratch.</w:t>
       </w:r>
     </w:p>
     <w:p>
@@ -2891,20 +4816,9 @@
     <w:p>
       <w:r>
         <w:rPr>
-          <w:b w:val="0"/>
           <w:sz w:val="22"/>
         </w:rPr>
-        <w:t>Feature Extraction achieves 77.30% with only 5,130 trainable parameters — 0.0% of all model parameters. This demonstrates the power of reusing general visual features: the ImageNet backbone, trained on 1.2 M images, provides representations that generalise to STL-10 natural images without any backbone adaptation. Training time is minimal because only the linear head is updated per step.</w:t>
-      </w:r>
-    </w:p>
-    <w:p/>
-    <w:p>
-      <w:r>
-        <w:rPr>
-          <w:b w:val="0"/>
-          <w:sz w:val="22"/>
-        </w:rPr>
-        <w:t>The generalisation gap is smallest in this condition because the frozen backbone cannot overfit to STL-10's small training set. The limitation is an accuracy ceiling imposed by the fixed feature space — which fine-tuning addresses.</w:t>
+        <w:t>Feature Extraction achieves 77.26% accuracy with only 5,130 trainable parameters — 0.05% of the full model. This +6.10 pp improvement over scratch demonstrates that ImageNet pretrained features generalise to STL-10 natural images without any backbone adaptation. The frozen backbone prevents overfitting on the small 5 000-sample training set, as confirmed by the smallest generalisation gap (ECE = 0.0127).</w:t>
       </w:r>
     </w:p>
     <w:p/>
@@ -2920,20 +4834,18 @@
     <w:p>
       <w:r>
         <w:rPr>
-          <w:b w:val="0"/>
           <w:sz w:val="22"/>
         </w:rPr>
-        <w:t>Fine-tuning achieves 90.55% (+19.39 pp vs scratch) by gently adapting the entire network. The differential learning rate strategy (backbone LR = 1e-3, head LR = 1e-2) is critical: a uniform high LR on the backbone causes catastrophic forgetting — the pretrained weights are destroyed before the head can leverage them — while a uniform low LR slows head convergence.</w:t>
+        <w:t>Fine-tuning achieves 90.65% — a +19.49 pp gain over scratch and +13.39 pp over Feature Extraction. The dramatic improvement stems from two factors: (1) a strong initialisation that avoids poor local minima, and (2) the ability to adapt intermediate representations to STL-10-specific visual patterns. The differential learning rate (α_b = 1e-3, α_h = 1e-2) is critical: using a uniform high LR on the backbone causes catastrophic forgetting, while a uniform low LR slows head convergence.</w:t>
       </w:r>
     </w:p>
     <w:p/>
     <w:p>
       <w:r>
         <w:rPr>
-          <w:b w:val="0"/>
           <w:sz w:val="22"/>
         </w:rPr>
-        <w:t>Cosine annealing ensures the learning rate decays smoothly to near-zero, allowing fine-grained weight refinement in later epochs without oscillation.</w:t>
+        <w:t>Epoch 1 validation accuracy for fine-tuning is 83.99%, compared to 23.76% for scratch — a 60.2 pp head-start that reflects the quality of the ImageNet initialisation.</w:t>
       </w:r>
     </w:p>
     <w:p/>
@@ -2943,16 +4855,15 @@
         <w:jc w:val="left"/>
       </w:pPr>
       <w:r>
-        <w:t>7.3 From Scratch Baseline</w:t>
+        <w:t>7.3 Calibration (ECE)</w:t>
       </w:r>
     </w:p>
     <w:p>
       <w:r>
         <w:rPr>
-          <w:b w:val="0"/>
           <w:sz w:val="22"/>
         </w:rPr>
-        <w:t>From scratch achieves 71.16% — a respectable result given that STL-10 has only 5 000 training samples. Strong data augmentation (random crop with 12-pixel padding, colour jitter, horizontal flip) and cosine-annealed SGD mitigate overfitting. However, the model must learn all visual features from scratch, limiting both final accuracy and convergence speed.</w:t>
+        <w:t>ECE measures how well a model's confidence matches its actual accuracy. Feature Extraction (ECE = 0.0127) is better calibrated than Fine-tuning (ECE = 0.0515) and Scratch (ECE = 0.0843). This is expected: the frozen backbone prevents the model from becoming overconfident on the small training set, whereas fine-tuning with full capacity on 5 000 samples tends to produce slightly overconfident predictions.</w:t>
       </w:r>
     </w:p>
     <w:p/>
@@ -2962,7 +4873,7 @@
         <w:jc w:val="left"/>
       </w:pPr>
       <w:r>
-        <w:t>7.4 Key Takeaways</w:t>
+        <w:t>7.4 Limitations</w:t>
       </w:r>
     </w:p>
     <w:p>
@@ -2973,7 +4884,7 @@
         <w:rPr>
           <w:sz w:val="22"/>
         </w:rPr>
-        <w:t>Pretrained Feature Extraction gains +6.14 pp over scratch using only 5,130 trainable parameters (vs 11,181,642).</w:t>
+        <w:t>Architecture mismatch: standard ResNet-18 with 7×7 conv1 is designed for 224×224 ImageNet images. At 96×96, layer4 produces 3×3 (not 7×7) feature maps, slightly reducing the richness of spatial features extracted.</w:t>
       </w:r>
     </w:p>
     <w:p>
@@ -2984,7 +4895,7 @@
         <w:rPr>
           <w:sz w:val="22"/>
         </w:rPr>
-        <w:t>Fine-tuning with differential LR gains +19.39 pp and is the recommended strategy when dataset size permits full adaptation.</w:t>
+        <w:t>Fine-tuning overfitting risk: training all 11 M parameters on 5 000 images is aggressive. The train accuracy reaches ~98% while validation plateaus at ~91%, indicating some overfitting.</w:t>
       </w:r>
     </w:p>
     <w:p>
@@ -2995,7 +4906,7 @@
         <w:rPr>
           <w:sz w:val="22"/>
         </w:rPr>
-        <w:t>Pretrained models converge faster — fewer epochs needed to reach practical performance thresholds, reducing compute cost.</w:t>
+        <w:t>Single run: results are from one random seed (42). Statistical significance across multiple seeds was not evaluated.</w:t>
       </w:r>
     </w:p>
     <w:p>
@@ -3006,7 +4917,7 @@
         <w:rPr>
           <w:sz w:val="22"/>
         </w:rPr>
-        <w:t>The architecture must match the input resolution: 96×96 is the minimum for standard ResNet-18 pretrained weights to produce informative features (layer4 must be ≥ 2×2).</w:t>
+        <w:t>Domain limitation: results are specific to the natural-image-to-natural-image transfer setting. Medical or satellite imagery would show different patterns.</w:t>
       </w:r>
     </w:p>
     <w:p>
@@ -3021,20 +4932,18 @@
     <w:p>
       <w:r>
         <w:rPr>
-          <w:b w:val="0"/>
           <w:sz w:val="22"/>
         </w:rPr>
-        <w:t>This experiment demonstrates that transfer learning from ImageNet to STL-10 yields clear, reproducible benefits in both final accuracy and convergence speed. Fine-tuning achieves the best result (90.55%), improving over training from scratch (71.16%) by +19.39 percentage points. Feature extraction with a frozen backbone offers a fast, parameter-efficient alternative (77.30%, 5,130 trainable params), at the cost of a lower accuracy ceiling.</w:t>
+        <w:t>This experiment demonstrates clear, reproducible benefits of transfer learning from ImageNet to STL-10. Fine-tuning achieves 90.65% test accuracy (+19.49 pp vs scratch) and converges to 75% accuracy in 1 epoch(s), compared to &gt;30 epochs from scratch. Feature Extraction with only 5,130 trainable parameters reaches 77.26% (+6.10 pp), offering a fast, parameter-efficient alternative with better calibration.</w:t>
       </w:r>
     </w:p>
     <w:p/>
     <w:p>
       <w:r>
         <w:rPr>
-          <w:b w:val="0"/>
           <w:sz w:val="22"/>
         </w:rPr>
-        <w:t>These results align with the transfer learning quadrant heuristic: when the target dataset is small and the source and target domains share visual statistics (natural images), pretrained representations consistently outperform random initialisation. The choice between feature extraction and fine-tuning depends on the available labelled data and the computational budget.</w:t>
+        <w:t>These results validate the transfer learning quadrant heuristic from the course slides: when the target dataset is small and the source and target domains share visual statistics, pretrained representations consistently outperform random initialisation in accuracy, convergence speed, and calibration. Fine-tuning with differential learning rates is the recommended strategy when the computational budget allows full model adaptation.</w:t>
       </w:r>
     </w:p>
     <w:sectPr>

</xml_diff>

<commit_message>
fix: add early convergence figure to Section 7.2 to support head-start claim
</commit_message>
<xml_diff>
--- a/Report.TL.STL10.docx
+++ b/Report.TL.STL10.docx
@@ -4845,7 +4845,59 @@
         <w:rPr>
           <w:sz w:val="22"/>
         </w:rPr>
-        <w:t>Epoch 1 validation accuracy for fine-tuning is 83.99%, compared to 23.76% for scratch — a 60.2 pp head-start that reflects the quality of the ImageNet initialisation.</w:t>
+        <w:t>Epoch 1 validation accuracy for fine-tuning is 83.99%, compared to 23.76% for scratch — a 60.2 pp head-start that reflects the quality of the ImageNet initialisation. This convergence advantage is shown in Figure 4 below.</w:t>
+      </w:r>
+    </w:p>
+    <w:p/>
+    <w:p>
+      <w:pPr>
+        <w:jc w:val="center"/>
+      </w:pPr>
+      <w:r>
+        <w:drawing>
+          <wp:inline xmlns:a="http://schemas.openxmlformats.org/drawingml/2006/main" xmlns:pic="http://schemas.openxmlformats.org/drawingml/2006/picture">
+            <wp:extent cx="5029200" cy="2463766"/>
+            <wp:docPr id="10" name="Picture 10"/>
+            <wp:cNvGraphicFramePr>
+              <a:graphicFrameLocks noChangeAspect="1"/>
+            </wp:cNvGraphicFramePr>
+            <a:graphic>
+              <a:graphicData uri="http://schemas.openxmlformats.org/drawingml/2006/picture">
+                <pic:pic>
+                  <pic:nvPicPr>
+                    <pic:cNvPr id="0" name="tl_early_convergence.png"/>
+                    <pic:cNvPicPr/>
+                  </pic:nvPicPr>
+                  <pic:blipFill>
+                    <a:blip r:embed="rId12"/>
+                    <a:stretch>
+                      <a:fillRect/>
+                    </a:stretch>
+                  </pic:blipFill>
+                  <pic:spPr>
+                    <a:xfrm>
+                      <a:off x="0" y="0"/>
+                      <a:ext cx="5029200" cy="2463766"/>
+                    </a:xfrm>
+                    <a:prstGeom prst="rect"/>
+                  </pic:spPr>
+                </pic:pic>
+              </a:graphicData>
+            </a:graphic>
+          </wp:inline>
+        </w:drawing>
+      </w:r>
+    </w:p>
+    <w:p>
+      <w:pPr>
+        <w:jc w:val="center"/>
+      </w:pPr>
+      <w:r>
+        <w:rPr>
+          <w:i/>
+          <w:sz w:val="20"/>
+        </w:rPr>
+        <w:t>Figure 4 (repeated): Validation accuracy in the first 10 epochs. Fine-tuning starts at 83.99% (epoch 1) — already above the scratch model's best accuracy across all 30 epochs. Scratch training needs ~17 epochs to match fine-tuning's epoch-1 performance.</w:t>
       </w:r>
     </w:p>
     <w:p/>

</xml_diff>

<commit_message>
revert: remove duplicate figure from Section 7.2 - discussion section does not need inline figures
</commit_message>
<xml_diff>
--- a/Report.TL.STL10.docx
+++ b/Report.TL.STL10.docx
@@ -4845,59 +4845,7 @@
         <w:rPr>
           <w:sz w:val="22"/>
         </w:rPr>
-        <w:t>Epoch 1 validation accuracy for fine-tuning is 83.99%, compared to 23.76% for scratch — a 60.2 pp head-start that reflects the quality of the ImageNet initialisation. This convergence advantage is shown in Figure 4 below.</w:t>
-      </w:r>
-    </w:p>
-    <w:p/>
-    <w:p>
-      <w:pPr>
-        <w:jc w:val="center"/>
-      </w:pPr>
-      <w:r>
-        <w:drawing>
-          <wp:inline xmlns:a="http://schemas.openxmlformats.org/drawingml/2006/main" xmlns:pic="http://schemas.openxmlformats.org/drawingml/2006/picture">
-            <wp:extent cx="5029200" cy="2463766"/>
-            <wp:docPr id="10" name="Picture 10"/>
-            <wp:cNvGraphicFramePr>
-              <a:graphicFrameLocks noChangeAspect="1"/>
-            </wp:cNvGraphicFramePr>
-            <a:graphic>
-              <a:graphicData uri="http://schemas.openxmlformats.org/drawingml/2006/picture">
-                <pic:pic>
-                  <pic:nvPicPr>
-                    <pic:cNvPr id="0" name="tl_early_convergence.png"/>
-                    <pic:cNvPicPr/>
-                  </pic:nvPicPr>
-                  <pic:blipFill>
-                    <a:blip r:embed="rId12"/>
-                    <a:stretch>
-                      <a:fillRect/>
-                    </a:stretch>
-                  </pic:blipFill>
-                  <pic:spPr>
-                    <a:xfrm>
-                      <a:off x="0" y="0"/>
-                      <a:ext cx="5029200" cy="2463766"/>
-                    </a:xfrm>
-                    <a:prstGeom prst="rect"/>
-                  </pic:spPr>
-                </pic:pic>
-              </a:graphicData>
-            </a:graphic>
-          </wp:inline>
-        </w:drawing>
-      </w:r>
-    </w:p>
-    <w:p>
-      <w:pPr>
-        <w:jc w:val="center"/>
-      </w:pPr>
-      <w:r>
-        <w:rPr>
-          <w:i/>
-          <w:sz w:val="20"/>
-        </w:rPr>
-        <w:t>Figure 4 (repeated): Validation accuracy in the first 10 epochs. Fine-tuning starts at 83.99% (epoch 1) — already above the scratch model's best accuracy across all 30 epochs. Scratch training needs ~17 epochs to match fine-tuning's epoch-1 performance.</w:t>
+        <w:t>Epoch 1 validation accuracy for fine-tuning is 83.99%, compared to 23.76% for scratch — a 60.2 pp head-start that reflects the quality of the ImageNet initialisation.</w:t>
       </w:r>
     </w:p>
     <w:p/>

</xml_diff>